<commit_message>
feat: implementacao do swagger para documentar a api
</commit_message>
<xml_diff>
--- a/docs/SAGE_PFC_v1.18.docx
+++ b/docs/SAGE_PFC_v1.18.docx
@@ -15,16 +15,7 @@
           <w:sz w:val="24"/>
           <w:szCs w:val="24"/>
         </w:rPr>
-        <w:t>FAI – CENTRO DE ENSINO SUPERIOR</w:t>
-      </w:r>
-      <w:bookmarkStart w:id="287" w:name="_GoBack"/>
-      <w:bookmarkEnd w:id="287"/>
-      <w:r>
-        <w:rPr>
-          <w:sz w:val="24"/>
-          <w:szCs w:val="24"/>
-        </w:rPr>
-        <w:t xml:space="preserve"> EM GESTÃO, TECNOLOGIA E EDUCAÇÃO</w:t>
+        <w:t>FAI – CENTRO DE ENSINO SUPERIOR EM GESTÃO, TECNOLOGIA E EDUCAÇÃO</w:t>
       </w:r>
     </w:p>
     <w:p>
@@ -11489,11 +11480,56 @@
       </w:r>
     </w:p>
     <w:p>
-      <w:r>
+      <w:pPr>
         <w:rPr>
           <w:rFonts w:hint="default"/>
         </w:rPr>
+      </w:pPr>
+      <w:r>
+        <w:rPr>
+          <w:rFonts w:hint="default"/>
+        </w:rPr>
         <w:t>Ferramentas de containerização: Docker (versão 24.0) para criação de containers isolados, possibilitando a execução consistente do sistema em diferentes ambientes e facilitando a implantação.</w:t>
+      </w:r>
+    </w:p>
+    <w:p>
+      <w:pPr>
+        <w:rPr>
+          <w:rFonts w:hint="default"/>
+        </w:rPr>
+      </w:pPr>
+      <w:r>
+        <w:rPr>
+          <w:rFonts w:hint="default"/>
+        </w:rPr>
+        <w:t xml:space="preserve">Ferramentas de desenvolvimento </w:t>
+      </w:r>
+      <w:r>
+        <w:rPr>
+          <w:rFonts w:hint="default"/>
+          <w:i/>
+          <w:iCs/>
+        </w:rPr>
+        <w:t>backend</w:t>
+      </w:r>
+      <w:r>
+        <w:rPr>
+          <w:rFonts w:hint="default"/>
+        </w:rPr>
+        <w:t>: Node.js (versão 2</w:t>
+      </w:r>
+      <w:r>
+        <w:rPr>
+          <w:rFonts w:hint="default"/>
+          <w:lang w:val="pt-BR"/>
+        </w:rPr>
+        <w:t>2</w:t>
+      </w:r>
+      <w:r>
+        <w:rPr>
+          <w:rFonts w:hint="default"/>
+        </w:rPr>
+        <w:t>) para construção de aplicações escaláveis e de alto desempenho no lado do servidor, oferecendo suporte a programação assíncrona e ampla compatibilidade com bibliotecas e frameworks modernos.</w:t>
       </w:r>
     </w:p>
     <w:p>
@@ -16556,10 +16592,10 @@
       <w:pPr>
         <w:pStyle w:val="4"/>
       </w:pPr>
-      <w:bookmarkStart w:id="81" w:name="_Toc46909558"/>
-      <w:bookmarkStart w:id="82" w:name="_Toc172810440"/>
-      <w:bookmarkStart w:id="83" w:name="_Toc204949524"/>
-      <w:bookmarkStart w:id="84" w:name="_Toc26364"/>
+      <w:bookmarkStart w:id="81" w:name="_Toc26364"/>
+      <w:bookmarkStart w:id="82" w:name="_Toc204949524"/>
+      <w:bookmarkStart w:id="83" w:name="_Toc46909558"/>
+      <w:bookmarkStart w:id="84" w:name="_Toc172810440"/>
       <w:r>
         <w:t>6.4.3 Heurísticas de Usabilidade</w:t>
       </w:r>
@@ -16861,8 +16897,8 @@
         <w:pStyle w:val="4"/>
       </w:pPr>
       <w:bookmarkStart w:id="85" w:name="_Toc30104"/>
-      <w:bookmarkStart w:id="86" w:name="_Toc204949525"/>
-      <w:bookmarkStart w:id="87" w:name="_Toc172810441"/>
+      <w:bookmarkStart w:id="86" w:name="_Toc172810441"/>
+      <w:bookmarkStart w:id="87" w:name="_Toc204949525"/>
       <w:r>
         <w:t>6.4.4 Projeto da Acessibilidade</w:t>
       </w:r>
@@ -17008,10 +17044,10 @@
       </w:pPr>
       <w:bookmarkStart w:id="88" w:name="_Toc172810442"/>
       <w:bookmarkStart w:id="89" w:name="_Toc46909559"/>
-      <w:bookmarkStart w:id="90" w:name="_Toc507747255"/>
-      <w:bookmarkStart w:id="91" w:name="_Toc14345922"/>
-      <w:bookmarkStart w:id="92" w:name="_Toc204949526"/>
-      <w:bookmarkStart w:id="93" w:name="_Toc28863"/>
+      <w:bookmarkStart w:id="90" w:name="_Toc14345922"/>
+      <w:bookmarkStart w:id="91" w:name="_Toc204949526"/>
+      <w:bookmarkStart w:id="92" w:name="_Toc28863"/>
+      <w:bookmarkStart w:id="93" w:name="_Toc507747255"/>
       <w:r>
         <w:t>6.5 PROJETO DO SISTEMA DISTRIBUÍDO</w:t>
       </w:r>
@@ -17044,9 +17080,9 @@
           <w:kern w:val="32"/>
         </w:rPr>
       </w:pPr>
-      <w:bookmarkStart w:id="94" w:name="_Toc204949527"/>
-      <w:bookmarkStart w:id="95" w:name="_Toc46909562"/>
-      <w:bookmarkStart w:id="96" w:name="_Toc172810445"/>
+      <w:bookmarkStart w:id="94" w:name="_Toc172810445"/>
+      <w:bookmarkStart w:id="95" w:name="_Toc204949527"/>
+      <w:bookmarkStart w:id="96" w:name="_Toc46909562"/>
       <w:bookmarkStart w:id="97" w:name="_Toc14345916"/>
       <w:r>
         <w:br w:type="page"/>
@@ -17125,10 +17161,10 @@
       <w:pPr>
         <w:pStyle w:val="3"/>
       </w:pPr>
-      <w:bookmarkStart w:id="100" w:name="_Toc20219"/>
+      <w:bookmarkStart w:id="100" w:name="_Toc172810446"/>
       <w:bookmarkStart w:id="101" w:name="_Toc46909563"/>
       <w:bookmarkStart w:id="102" w:name="_Toc204949528"/>
-      <w:bookmarkStart w:id="103" w:name="_Toc172810446"/>
+      <w:bookmarkStart w:id="103" w:name="_Toc20219"/>
       <w:bookmarkStart w:id="104" w:name="_Toc14345918"/>
       <w:r>
         <w:t>7.1 COMPONENTES DO SISTEMA DE SOFTWARE</w:t>
@@ -17339,10 +17375,10 @@
           <w:color w:val="0000FF"/>
         </w:rPr>
       </w:pPr>
-      <w:bookmarkStart w:id="105" w:name="_Toc172810447"/>
-      <w:bookmarkStart w:id="106" w:name="_Toc204949529"/>
+      <w:bookmarkStart w:id="105" w:name="_Toc46909564"/>
+      <w:bookmarkStart w:id="106" w:name="_Toc172810447"/>
       <w:bookmarkStart w:id="107" w:name="_Toc5884"/>
-      <w:bookmarkStart w:id="108" w:name="_Toc46909564"/>
+      <w:bookmarkStart w:id="108" w:name="_Toc204949529"/>
       <w:r>
         <w:t>7.2 TECNOLOGIAS DE IMPLEMENTAÇÃO</w:t>
       </w:r>
@@ -17355,10 +17391,10 @@
       <w:pPr>
         <w:pStyle w:val="4"/>
       </w:pPr>
-      <w:bookmarkStart w:id="109" w:name="_Toc172810448"/>
+      <w:bookmarkStart w:id="109" w:name="_Toc24234"/>
       <w:bookmarkStart w:id="110" w:name="_Toc46909565"/>
-      <w:bookmarkStart w:id="111" w:name="_Toc204949530"/>
-      <w:bookmarkStart w:id="112" w:name="_Toc24234"/>
+      <w:bookmarkStart w:id="111" w:name="_Toc172810448"/>
+      <w:bookmarkStart w:id="112" w:name="_Toc204949530"/>
       <w:r>
         <w:t xml:space="preserve">7.2.1 Linguagens de Programação e </w:t>
       </w:r>
@@ -17434,16 +17470,71 @@
         <w:ind w:firstLine="708"/>
       </w:pPr>
       <w:r>
-        <w:t xml:space="preserve">O front-end está implementado com Angular, um </w:t>
-      </w:r>
-      <w:r>
-        <w:rPr>
+        <w:rPr>
+          <w:rFonts w:hint="default"/>
+        </w:rPr>
+        <w:t xml:space="preserve">O </w:t>
+      </w:r>
+      <w:r>
+        <w:rPr>
+          <w:rFonts w:hint="default"/>
           <w:i/>
+          <w:iCs/>
+        </w:rPr>
+        <w:t>front-end</w:t>
+      </w:r>
+      <w:r>
+        <w:rPr>
+          <w:rFonts w:hint="default"/>
+        </w:rPr>
+        <w:t xml:space="preserve"> está implementado com Angular, um </w:t>
+      </w:r>
+      <w:r>
+        <w:rPr>
+          <w:rFonts w:hint="default"/>
+          <w:i/>
+          <w:iCs/>
         </w:rPr>
         <w:t>framework</w:t>
       </w:r>
       <w:r>
-        <w:t xml:space="preserve"> baseado em TypeScript que facilita a criação de interfaces dinâmicas, responsivas e modulares. São empregadas também a HTML e as folhas de estilo CSS, responsáveis pela estruturação e estilização dos elementos visuais da aplicação, respectivamente. O Angular possibilita a organização do código em componentes reutilizáveis, além de oferecer recursos como injeção de dependência, roteamento e validações de formulários.</w:t>
+        <w:rPr>
+          <w:rFonts w:hint="default"/>
+        </w:rPr>
+        <w:t xml:space="preserve"> baseado em TypeScript que facilita a criação de interfaces dinâmicas, responsivas e modulares. São empregadas também a HTML e as folhas de estilo CSS, responsáveis pela estruturação e estilização dos elementos visuais da aplicação, respectivamente. O Angular possibilita a organização do código em componentes reutilizáveis, além de oferecer recursos como injeção de dependência, roteamento e validações de formulários. No </w:t>
+      </w:r>
+      <w:r>
+        <w:rPr>
+          <w:rFonts w:hint="default"/>
+          <w:i/>
+          <w:iCs/>
+        </w:rPr>
+        <w:t>back-end</w:t>
+      </w:r>
+      <w:r>
+        <w:rPr>
+          <w:rFonts w:hint="default"/>
+        </w:rPr>
+        <w:t xml:space="preserve">, utiliza-se o Node.js, que fornece um ambiente de execução JavaScript eficiente e escalável, possibilitando a comunicação entre o </w:t>
+      </w:r>
+      <w:bookmarkStart w:id="287" w:name="_GoBack"/>
+      <w:r>
+        <w:rPr>
+          <w:rFonts w:hint="default"/>
+          <w:i/>
+          <w:iCs/>
+        </w:rPr>
+        <w:t>front-end</w:t>
+      </w:r>
+      <w:bookmarkEnd w:id="287"/>
+      <w:r>
+        <w:rPr>
+          <w:rFonts w:hint="default"/>
+        </w:rPr>
+        <w:t xml:space="preserve"> e os serviços da aplicação, além de garantir maior flexibilidade na integração com bibliotecas e APIs modernas</w:t>
+      </w:r>
+      <w:r>
+        <w:t>.</w:t>
       </w:r>
     </w:p>
     <w:p>
@@ -17647,11 +17738,11 @@
         <w:pStyle w:val="4"/>
       </w:pPr>
       <w:bookmarkStart w:id="113" w:name="_Toc507747252"/>
-      <w:bookmarkStart w:id="114" w:name="_Toc20794"/>
-      <w:bookmarkStart w:id="115" w:name="_Toc204949531"/>
-      <w:bookmarkStart w:id="116" w:name="_Toc172810449"/>
-      <w:bookmarkStart w:id="117" w:name="_Toc46909566"/>
-      <w:bookmarkStart w:id="118" w:name="_Toc14345919"/>
+      <w:bookmarkStart w:id="114" w:name="_Toc204949531"/>
+      <w:bookmarkStart w:id="115" w:name="_Toc20794"/>
+      <w:bookmarkStart w:id="116" w:name="_Toc14345919"/>
+      <w:bookmarkStart w:id="117" w:name="_Toc172810449"/>
+      <w:bookmarkStart w:id="118" w:name="_Toc46909566"/>
       <w:r>
         <w:t xml:space="preserve">7.2.2 </w:t>
       </w:r>
@@ -17917,8 +18008,8 @@
       <w:bookmarkStart w:id="120" w:name="_Toc204949532"/>
       <w:bookmarkStart w:id="121" w:name="_Toc46909567"/>
       <w:bookmarkStart w:id="122" w:name="_Toc172810450"/>
-      <w:bookmarkStart w:id="123" w:name="_Toc25265"/>
-      <w:bookmarkStart w:id="124" w:name="_Toc14345920"/>
+      <w:bookmarkStart w:id="123" w:name="_Toc14345920"/>
+      <w:bookmarkStart w:id="124" w:name="_Toc25265"/>
       <w:r>
         <w:t>7.2.3 Convenções e Guias para Codificação</w:t>
       </w:r>
@@ -18306,10 +18397,10 @@
         <w:pStyle w:val="4"/>
       </w:pPr>
       <w:bookmarkStart w:id="125" w:name="_Toc204949533"/>
-      <w:bookmarkStart w:id="126" w:name="_Toc46909568"/>
-      <w:bookmarkStart w:id="127" w:name="_Toc24842"/>
-      <w:bookmarkStart w:id="128" w:name="_Toc14345915"/>
-      <w:bookmarkStart w:id="129" w:name="_Toc507747250"/>
+      <w:bookmarkStart w:id="126" w:name="_Toc24842"/>
+      <w:bookmarkStart w:id="127" w:name="_Toc507747250"/>
+      <w:bookmarkStart w:id="128" w:name="_Toc46909568"/>
+      <w:bookmarkStart w:id="129" w:name="_Toc14345915"/>
       <w:bookmarkStart w:id="130" w:name="_Toc172810451"/>
       <w:r>
         <w:t>7.2.4 Estrutura Física do Banco de Dados</w:t>
@@ -18343,11 +18434,11 @@
           <w:color w:val="0000FF"/>
         </w:rPr>
       </w:pPr>
-      <w:bookmarkStart w:id="131" w:name="_Toc46909569"/>
-      <w:bookmarkStart w:id="132" w:name="_Toc172810452"/>
-      <w:bookmarkStart w:id="133" w:name="_Toc204949534"/>
-      <w:bookmarkStart w:id="134" w:name="_Toc14345921"/>
-      <w:bookmarkStart w:id="135" w:name="_Toc17202"/>
+      <w:bookmarkStart w:id="131" w:name="_Toc172810452"/>
+      <w:bookmarkStart w:id="132" w:name="_Toc204949534"/>
+      <w:bookmarkStart w:id="133" w:name="_Toc46909569"/>
+      <w:bookmarkStart w:id="134" w:name="_Toc17202"/>
+      <w:bookmarkStart w:id="135" w:name="_Toc14345921"/>
       <w:r>
         <w:t>7.3 ANÁLISE DE COMPLEXIDADE ALGORÍTMICA</w:t>
       </w:r>
@@ -18562,11 +18653,11 @@
         <w:pStyle w:val="2"/>
       </w:pPr>
       <w:bookmarkStart w:id="136" w:name="_Toc204949535"/>
-      <w:bookmarkStart w:id="137" w:name="_Toc507747262"/>
-      <w:bookmarkStart w:id="138" w:name="_Toc172810453"/>
-      <w:bookmarkStart w:id="139" w:name="_Toc46909570"/>
-      <w:bookmarkStart w:id="140" w:name="_Toc14345929"/>
-      <w:bookmarkStart w:id="141" w:name="_Toc25807"/>
+      <w:bookmarkStart w:id="137" w:name="_Toc172810453"/>
+      <w:bookmarkStart w:id="138" w:name="_Toc507747262"/>
+      <w:bookmarkStart w:id="139" w:name="_Toc25807"/>
+      <w:bookmarkStart w:id="140" w:name="_Toc46909570"/>
+      <w:bookmarkStart w:id="141" w:name="_Toc14345929"/>
       <w:r>
         <w:t>8 PLANO DE TESTES</w:t>
       </w:r>
@@ -18602,12 +18693,12 @@
           <w:rFonts w:eastAsia="Arial Unicode MS"/>
         </w:rPr>
       </w:pPr>
-      <w:bookmarkStart w:id="142" w:name="_Toc507747263"/>
-      <w:bookmarkStart w:id="143" w:name="_Toc18606"/>
-      <w:bookmarkStart w:id="144" w:name="_Toc204949536"/>
-      <w:bookmarkStart w:id="145" w:name="_Toc172810454"/>
-      <w:bookmarkStart w:id="146" w:name="_Toc46909571"/>
-      <w:bookmarkStart w:id="147" w:name="_Toc14345930"/>
+      <w:bookmarkStart w:id="142" w:name="_Toc172810454"/>
+      <w:bookmarkStart w:id="143" w:name="_Toc14345930"/>
+      <w:bookmarkStart w:id="144" w:name="_Toc507747263"/>
+      <w:bookmarkStart w:id="145" w:name="_Toc18606"/>
+      <w:bookmarkStart w:id="146" w:name="_Toc204949536"/>
+      <w:bookmarkStart w:id="147" w:name="_Toc46909571"/>
       <w:r>
         <w:rPr>
           <w:rFonts w:eastAsia="Arial Unicode MS"/>
@@ -18864,11 +18955,11 @@
           <w:rFonts w:eastAsia="Arial Unicode MS"/>
         </w:rPr>
       </w:pPr>
-      <w:bookmarkStart w:id="148" w:name="_Toc46909572"/>
-      <w:bookmarkStart w:id="149" w:name="_Toc14345931"/>
-      <w:bookmarkStart w:id="150" w:name="_Toc172810455"/>
-      <w:bookmarkStart w:id="151" w:name="_Toc204949537"/>
-      <w:bookmarkStart w:id="152" w:name="_Toc507747264"/>
+      <w:bookmarkStart w:id="148" w:name="_Toc14345931"/>
+      <w:bookmarkStart w:id="149" w:name="_Toc172810455"/>
+      <w:bookmarkStart w:id="150" w:name="_Toc46909572"/>
+      <w:bookmarkStart w:id="151" w:name="_Toc507747264"/>
+      <w:bookmarkStart w:id="152" w:name="_Toc204949537"/>
     </w:p>
     <w:p>
       <w:pPr>
@@ -19155,11 +19246,11 @@
         <w:pStyle w:val="4"/>
       </w:pPr>
       <w:bookmarkStart w:id="154" w:name="_Toc14345932"/>
-      <w:bookmarkStart w:id="155" w:name="_Toc507747265"/>
-      <w:bookmarkStart w:id="156" w:name="_Toc172810456"/>
-      <w:bookmarkStart w:id="157" w:name="_Toc46909573"/>
+      <w:bookmarkStart w:id="155" w:name="_Toc46909573"/>
+      <w:bookmarkStart w:id="156" w:name="_Toc204949538"/>
+      <w:bookmarkStart w:id="157" w:name="_Toc172810456"/>
       <w:bookmarkStart w:id="158" w:name="_Toc14606"/>
-      <w:bookmarkStart w:id="159" w:name="_Toc204949538"/>
+      <w:bookmarkStart w:id="159" w:name="_Toc507747265"/>
       <w:r>
         <w:t>8.2.1 Referências aos Documentos Relevantes</w:t>
       </w:r>
@@ -19386,9 +19477,9 @@
       <w:r>
         <w:t xml:space="preserve">   </w:t>
       </w:r>
-      <w:bookmarkStart w:id="162" w:name="_Toc78782581"/>
-      <w:bookmarkStart w:id="163" w:name="_Toc204949481"/>
-      <w:bookmarkStart w:id="164" w:name="_Toc172810391"/>
+      <w:bookmarkStart w:id="162" w:name="_Toc204949481"/>
+      <w:bookmarkStart w:id="163" w:name="_Toc172810391"/>
+      <w:bookmarkStart w:id="164" w:name="_Toc78782581"/>
       <w:r>
         <w:t xml:space="preserve">QUADRO </w:t>
       </w:r>
@@ -19429,12 +19520,12 @@
         <w:pStyle w:val="4"/>
       </w:pPr>
       <w:bookmarkStart w:id="165" w:name="_Toc191128985"/>
-      <w:bookmarkStart w:id="166" w:name="_Toc204949539"/>
-      <w:bookmarkStart w:id="167" w:name="_Toc46909574"/>
-      <w:bookmarkStart w:id="168" w:name="_Toc507747266"/>
-      <w:bookmarkStart w:id="169" w:name="_Toc14345933"/>
-      <w:bookmarkStart w:id="170" w:name="_Toc172810457"/>
-      <w:bookmarkStart w:id="171" w:name="_Toc22317"/>
+      <w:bookmarkStart w:id="166" w:name="_Toc22317"/>
+      <w:bookmarkStart w:id="167" w:name="_Toc14345933"/>
+      <w:bookmarkStart w:id="168" w:name="_Toc204949539"/>
+      <w:bookmarkStart w:id="169" w:name="_Toc507747266"/>
+      <w:bookmarkStart w:id="170" w:name="_Toc46909574"/>
+      <w:bookmarkStart w:id="171" w:name="_Toc172810457"/>
       <w:r>
         <w:t>8.2.2 Ambiente</w:t>
       </w:r>
@@ -19789,10 +19880,10 @@
         </w:rPr>
         <w:t xml:space="preserve">   </w:t>
       </w:r>
-      <w:bookmarkStart w:id="172" w:name="_Toc172810392"/>
-      <w:bookmarkStart w:id="173" w:name="_Toc507751105"/>
-      <w:bookmarkStart w:id="174" w:name="_Toc14343276"/>
-      <w:bookmarkStart w:id="175" w:name="_Toc204949482"/>
+      <w:bookmarkStart w:id="172" w:name="_Toc14343276"/>
+      <w:bookmarkStart w:id="173" w:name="_Toc204949482"/>
+      <w:bookmarkStart w:id="174" w:name="_Toc507751105"/>
+      <w:bookmarkStart w:id="175" w:name="_Toc172810392"/>
       <w:bookmarkStart w:id="176" w:name="_Toc78782582"/>
       <w:r>
         <w:t xml:space="preserve">QUADRO </w:t>
@@ -20167,10 +20258,10 @@
         <w:t xml:space="preserve">   </w:t>
       </w:r>
       <w:bookmarkStart w:id="178" w:name="_Toc78782583"/>
-      <w:bookmarkStart w:id="179" w:name="_Toc172810393"/>
+      <w:bookmarkStart w:id="179" w:name="_Toc14343277"/>
       <w:bookmarkStart w:id="180" w:name="_Toc507751106"/>
-      <w:bookmarkStart w:id="181" w:name="_Toc204949483"/>
-      <w:bookmarkStart w:id="182" w:name="_Toc14343277"/>
+      <w:bookmarkStart w:id="181" w:name="_Toc172810393"/>
+      <w:bookmarkStart w:id="182" w:name="_Toc204949483"/>
       <w:r>
         <w:t xml:space="preserve">QUADRO </w:t>
       </w:r>
@@ -20244,16 +20335,16 @@
           <w:color w:val="0000FF"/>
         </w:rPr>
       </w:pPr>
-      <w:bookmarkStart w:id="189" w:name="_Toc46909579"/>
-      <w:bookmarkStart w:id="190" w:name="_Toc14345938"/>
+      <w:bookmarkStart w:id="189" w:name="_Toc14345938"/>
+      <w:bookmarkStart w:id="190" w:name="_Toc46909579"/>
       <w:bookmarkStart w:id="191" w:name="_Toc507747271"/>
     </w:p>
     <w:p>
       <w:pPr>
         <w:pStyle w:val="3"/>
       </w:pPr>
-      <w:bookmarkStart w:id="192" w:name="_Toc172810459"/>
-      <w:bookmarkStart w:id="193" w:name="_Toc4641"/>
+      <w:bookmarkStart w:id="192" w:name="_Toc4641"/>
+      <w:bookmarkStart w:id="193" w:name="_Toc172810459"/>
       <w:bookmarkStart w:id="194" w:name="_Toc204949541"/>
       <w:r>
         <w:t>8.4 RESULTADOS DOS TESTES</w:t>
@@ -20291,11 +20382,11 @@
           <w:color w:val="0000FF"/>
         </w:rPr>
       </w:pPr>
-      <w:bookmarkStart w:id="195" w:name="_Toc46909582"/>
+      <w:bookmarkStart w:id="195" w:name="_Toc507747274"/>
       <w:bookmarkStart w:id="196" w:name="_Toc204949542"/>
-      <w:bookmarkStart w:id="197" w:name="_Toc507747274"/>
+      <w:bookmarkStart w:id="197" w:name="_Toc14345941"/>
       <w:bookmarkStart w:id="198" w:name="_Toc172810460"/>
-      <w:bookmarkStart w:id="199" w:name="_Toc14345941"/>
+      <w:bookmarkStart w:id="199" w:name="_Toc46909582"/>
       <w:r>
         <w:rPr>
           <w:color w:val="0000FF"/>
@@ -20354,12 +20445,12 @@
           <w:color w:val="0000FF"/>
         </w:rPr>
       </w:pPr>
-      <w:bookmarkStart w:id="201" w:name="_Toc28810"/>
-      <w:bookmarkStart w:id="202" w:name="_Toc172810461"/>
-      <w:bookmarkStart w:id="203" w:name="_Toc204949543"/>
-      <w:bookmarkStart w:id="204" w:name="_Toc14345942"/>
-      <w:bookmarkStart w:id="205" w:name="_Toc507747275"/>
-      <w:bookmarkStart w:id="206" w:name="_Toc46909583"/>
+      <w:bookmarkStart w:id="201" w:name="_Toc14345942"/>
+      <w:bookmarkStart w:id="202" w:name="_Toc204949543"/>
+      <w:bookmarkStart w:id="203" w:name="_Toc507747275"/>
+      <w:bookmarkStart w:id="204" w:name="_Toc28810"/>
+      <w:bookmarkStart w:id="205" w:name="_Toc46909583"/>
+      <w:bookmarkStart w:id="206" w:name="_Toc172810461"/>
       <w:r>
         <w:rPr>
           <w:rFonts w:eastAsia="Arial Unicode MS"/>
@@ -20407,10 +20498,10 @@
       </w:pPr>
       <w:bookmarkStart w:id="207" w:name="_Toc14345943"/>
       <w:bookmarkStart w:id="208" w:name="_Toc12632"/>
-      <w:bookmarkStart w:id="209" w:name="_Toc46909584"/>
-      <w:bookmarkStart w:id="210" w:name="_Toc507747276"/>
-      <w:bookmarkStart w:id="211" w:name="_Toc204949544"/>
-      <w:bookmarkStart w:id="212" w:name="_Toc172810462"/>
+      <w:bookmarkStart w:id="209" w:name="_Toc204949544"/>
+      <w:bookmarkStart w:id="210" w:name="_Toc172810462"/>
+      <w:bookmarkStart w:id="211" w:name="_Toc46909584"/>
+      <w:bookmarkStart w:id="212" w:name="_Toc507747276"/>
       <w:r>
         <w:t>9.1.1 Descrição da Metodologia</w:t>
       </w:r>
@@ -20445,12 +20536,12 @@
       <w:pPr>
         <w:pStyle w:val="4"/>
       </w:pPr>
-      <w:bookmarkStart w:id="213" w:name="_Toc14345944"/>
+      <w:bookmarkStart w:id="213" w:name="_Toc507747277"/>
       <w:bookmarkStart w:id="214" w:name="_Toc204949545"/>
-      <w:bookmarkStart w:id="215" w:name="_Toc46909585"/>
-      <w:bookmarkStart w:id="216" w:name="_Toc13586"/>
-      <w:bookmarkStart w:id="217" w:name="_Toc172810463"/>
-      <w:bookmarkStart w:id="218" w:name="_Toc507747277"/>
+      <w:bookmarkStart w:id="215" w:name="_Toc13586"/>
+      <w:bookmarkStart w:id="216" w:name="_Toc172810463"/>
+      <w:bookmarkStart w:id="217" w:name="_Toc14345944"/>
+      <w:bookmarkStart w:id="218" w:name="_Toc46909585"/>
       <w:r>
         <w:t>9.1.2 Matriz de Responsabilidade</w:t>
       </w:r>
@@ -21596,11 +21687,11 @@
           <w:color w:val="0000FF"/>
         </w:rPr>
       </w:pPr>
-      <w:bookmarkStart w:id="219" w:name="_Toc204949484"/>
-      <w:bookmarkStart w:id="220" w:name="_Toc172810394"/>
-      <w:bookmarkStart w:id="221" w:name="_Toc78782587"/>
-      <w:bookmarkStart w:id="222" w:name="_Toc14343281"/>
-      <w:bookmarkStart w:id="223" w:name="_Toc507751111"/>
+      <w:bookmarkStart w:id="219" w:name="_Toc78782587"/>
+      <w:bookmarkStart w:id="220" w:name="_Toc204949484"/>
+      <w:bookmarkStart w:id="221" w:name="_Toc507751111"/>
+      <w:bookmarkStart w:id="222" w:name="_Toc172810394"/>
+      <w:bookmarkStart w:id="223" w:name="_Toc14343281"/>
       <w:r>
         <w:rPr>
           <w:color w:val="0000FF"/>
@@ -21663,12 +21754,12 @@
           <w:color w:val="0000FF"/>
         </w:rPr>
       </w:pPr>
-      <w:bookmarkStart w:id="224" w:name="_Toc46909586"/>
-      <w:bookmarkStart w:id="225" w:name="_Toc14345945"/>
-      <w:bookmarkStart w:id="226" w:name="_Toc507747278"/>
-      <w:bookmarkStart w:id="227" w:name="_Toc13797"/>
-      <w:bookmarkStart w:id="228" w:name="_Toc172810464"/>
-      <w:bookmarkStart w:id="229" w:name="_Toc204949546"/>
+      <w:bookmarkStart w:id="224" w:name="_Toc13797"/>
+      <w:bookmarkStart w:id="225" w:name="_Toc172810464"/>
+      <w:bookmarkStart w:id="226" w:name="_Toc14345945"/>
+      <w:bookmarkStart w:id="227" w:name="_Toc204949546"/>
+      <w:bookmarkStart w:id="228" w:name="_Toc46909586"/>
+      <w:bookmarkStart w:id="229" w:name="_Toc507747278"/>
       <w:r>
         <w:rPr>
           <w:color w:val="0000FF"/>
@@ -22227,10 +22318,10 @@
         </w:rPr>
       </w:pPr>
       <w:bookmarkStart w:id="241" w:name="_Toc172810396"/>
-      <w:bookmarkStart w:id="242" w:name="_Toc14343283"/>
-      <w:bookmarkStart w:id="243" w:name="_Toc507751113"/>
-      <w:bookmarkStart w:id="244" w:name="_Toc204949486"/>
-      <w:bookmarkStart w:id="245" w:name="_Toc78782589"/>
+      <w:bookmarkStart w:id="242" w:name="_Toc204949486"/>
+      <w:bookmarkStart w:id="243" w:name="_Toc14343283"/>
+      <w:bookmarkStart w:id="244" w:name="_Toc78782589"/>
+      <w:bookmarkStart w:id="245" w:name="_Toc507751113"/>
       <w:r>
         <w:rPr>
           <w:color w:val="0000FF"/>
@@ -22295,11 +22386,11 @@
         </w:rPr>
       </w:pPr>
       <w:bookmarkStart w:id="246" w:name="_Toc172810466"/>
-      <w:bookmarkStart w:id="247" w:name="_Toc507747280"/>
-      <w:bookmarkStart w:id="248" w:name="_Toc14345947"/>
-      <w:bookmarkStart w:id="249" w:name="_Toc46909588"/>
-      <w:bookmarkStart w:id="250" w:name="_Toc204949548"/>
-      <w:bookmarkStart w:id="251" w:name="_Toc2408"/>
+      <w:bookmarkStart w:id="247" w:name="_Toc14345947"/>
+      <w:bookmarkStart w:id="248" w:name="_Toc507747280"/>
+      <w:bookmarkStart w:id="249" w:name="_Toc2408"/>
+      <w:bookmarkStart w:id="250" w:name="_Toc46909588"/>
+      <w:bookmarkStart w:id="251" w:name="_Toc204949548"/>
       <w:r>
         <w:rPr>
           <w:color w:val="0000FF"/>
@@ -22645,11 +22736,11 @@
           <w:color w:val="0000FF"/>
         </w:rPr>
       </w:pPr>
-      <w:bookmarkStart w:id="252" w:name="_Toc172810397"/>
-      <w:bookmarkStart w:id="253" w:name="_Toc78782590"/>
-      <w:bookmarkStart w:id="254" w:name="_Toc14343284"/>
-      <w:bookmarkStart w:id="255" w:name="_Toc204949487"/>
-      <w:bookmarkStart w:id="256" w:name="_Toc507751114"/>
+      <w:bookmarkStart w:id="252" w:name="_Toc507751114"/>
+      <w:bookmarkStart w:id="253" w:name="_Toc204949487"/>
+      <w:bookmarkStart w:id="254" w:name="_Toc172810397"/>
+      <w:bookmarkStart w:id="255" w:name="_Toc78782590"/>
+      <w:bookmarkStart w:id="256" w:name="_Toc14343284"/>
       <w:r>
         <w:rPr>
           <w:color w:val="0000FF"/>
@@ -22713,12 +22804,12 @@
           <w:color w:val="0000FF"/>
         </w:rPr>
       </w:pPr>
-      <w:bookmarkStart w:id="257" w:name="_Toc204949549"/>
-      <w:bookmarkStart w:id="258" w:name="_Toc46909589"/>
-      <w:bookmarkStart w:id="259" w:name="_Toc14345948"/>
-      <w:bookmarkStart w:id="260" w:name="_Toc507747281"/>
-      <w:bookmarkStart w:id="261" w:name="_Toc172810467"/>
-      <w:bookmarkStart w:id="262" w:name="_Toc25573"/>
+      <w:bookmarkStart w:id="257" w:name="_Toc172810467"/>
+      <w:bookmarkStart w:id="258" w:name="_Toc507747281"/>
+      <w:bookmarkStart w:id="259" w:name="_Toc25573"/>
+      <w:bookmarkStart w:id="260" w:name="_Toc46909589"/>
+      <w:bookmarkStart w:id="261" w:name="_Toc204949549"/>
+      <w:bookmarkStart w:id="262" w:name="_Toc14345948"/>
       <w:r>
         <w:rPr>
           <w:color w:val="0000FF"/>
@@ -23463,8 +23554,8 @@
         <w:br w:type="page"/>
       </w:r>
       <w:bookmarkStart w:id="269" w:name="_Toc10367"/>
-      <w:bookmarkStart w:id="270" w:name="_Toc284603410"/>
-      <w:bookmarkStart w:id="271" w:name="_Toc192060122"/>
+      <w:bookmarkStart w:id="270" w:name="_Toc192060122"/>
+      <w:bookmarkStart w:id="271" w:name="_Toc284603410"/>
       <w:r>
         <w:t>APÊNDICE B – RELATÓRIO DE DESEMPENHO</w:t>
       </w:r>
@@ -24738,7 +24829,7 @@
     <w:lsdException w:qFormat="1" w:unhideWhenUsed="0" w:uiPriority="10" w:semiHidden="0" w:name="Title"/>
     <w:lsdException w:uiPriority="99" w:name="Closing"/>
     <w:lsdException w:uiPriority="99" w:name="Signature"/>
-    <w:lsdException w:uiPriority="1" w:name="Default Paragraph Font"/>
+    <w:lsdException w:qFormat="1" w:uiPriority="1" w:name="Default Paragraph Font"/>
     <w:lsdException w:uiPriority="99" w:name="Body Text"/>
     <w:lsdException w:uiPriority="99" w:name="Body Text Indent"/>
     <w:lsdException w:uiPriority="99" w:name="List Continue"/>
@@ -24918,6 +25009,7 @@
     <w:name w:val="Default Paragraph Font"/>
     <w:semiHidden/>
     <w:unhideWhenUsed/>
+    <w:qFormat/>
     <w:uiPriority w:val="1"/>
   </w:style>
   <w:style w:type="table" w:default="1" w:styleId="7">

</xml_diff>

<commit_message>
doc: atualizacao dos apontamentos no artefato de sistema distribuido
</commit_message>
<xml_diff>
--- a/docs/SAGE_PFC_v1.18.docx
+++ b/docs/SAGE_PFC_v1.18.docx
@@ -11447,89 +11447,102 @@
       </w:r>
     </w:p>
     <w:p>
-      <w:r>
-        <w:t>Ferramentas de desenvolvimento de código: Visual Studio Code (versão 1.88) como IDE principal para codificação. Postman (versão 10) para testes de requisições da API.</w:t>
-      </w:r>
-    </w:p>
-    <w:p>
-      <w:r>
-        <w:t>Ferramentas de documentação: Microsoft Word 2016 para redação do projeto e documentação formal.</w:t>
-      </w:r>
-    </w:p>
-    <w:p>
-      <w:r>
-        <w:t>Sistema operacional: Windows 11 para ambiente de desenvolvimento e testes.</w:t>
-      </w:r>
-    </w:p>
-    <w:p>
-      <w:r>
-        <w:t>Controle de versionamento de código e repositório: Git para controle de versionamento de código e Github para hospedagem do repositório.</w:t>
-      </w:r>
-    </w:p>
-    <w:p>
-      <w:r>
-        <w:t>Ferramentas de Inteligência Artificial: GPT-4.1 nano da OpenAI para correções ortográficas e realização de tarefas repetitivas.</w:t>
-      </w:r>
-    </w:p>
-    <w:p>
-      <w:r>
-        <w:rPr>
-          <w:rFonts w:hint="default"/>
-        </w:rPr>
-        <w:t>Ferramentas de teste automatizado: JUnit (versão 5) para realização de testes unitários do código Java, garantindo a qualidade e a confiabilidade das funcionalidades implementadas.</w:t>
-      </w:r>
-    </w:p>
-    <w:p>
-      <w:pPr>
-        <w:rPr>
-          <w:rFonts w:hint="default"/>
-        </w:rPr>
-      </w:pPr>
-      <w:r>
-        <w:rPr>
-          <w:rFonts w:hint="default"/>
-        </w:rPr>
-        <w:t>Ferramentas de containerização: Docker (versão 24.0) para criação de containers isolados, possibilitando a execução consistente do sistema em diferentes ambientes e facilitando a implantação.</w:t>
-      </w:r>
-    </w:p>
-    <w:p>
-      <w:pPr>
-        <w:rPr>
-          <w:rFonts w:hint="default"/>
-        </w:rPr>
-      </w:pPr>
-      <w:r>
-        <w:rPr>
-          <w:rFonts w:hint="default"/>
-        </w:rPr>
-        <w:t xml:space="preserve">Ferramentas de desenvolvimento </w:t>
-      </w:r>
-      <w:r>
-        <w:rPr>
-          <w:rFonts w:hint="default"/>
-          <w:i/>
-          <w:iCs/>
-        </w:rPr>
-        <w:t>backend</w:t>
-      </w:r>
-      <w:r>
-        <w:rPr>
-          <w:rFonts w:hint="default"/>
-        </w:rPr>
-        <w:t>: Node.js (versão 2</w:t>
-      </w:r>
-      <w:r>
+      <w:pPr>
         <w:rPr>
           <w:rFonts w:hint="default"/>
           <w:lang w:val="pt-BR"/>
         </w:rPr>
+      </w:pPr>
+      <w:r>
+        <w:t>Ferramentas de desenvolvimento de código: Visual Studio Code (versão 1.88) como IDE principal para codificação. Postman (versão 10) para testes de requisições da API.</w:t>
+      </w:r>
+      <w:r>
+        <w:rPr>
+          <w:rFonts w:hint="default"/>
+          <w:lang w:val="pt-BR"/>
+        </w:rPr>
+        <w:t xml:space="preserve"> </w:t>
+      </w:r>
+      <w:r>
+        <w:rPr>
+          <w:rFonts w:hint="default"/>
+        </w:rPr>
+        <w:t>Node.js (versão 2</w:t>
+      </w:r>
+      <w:r>
+        <w:rPr>
+          <w:rFonts w:hint="default"/>
+          <w:lang w:val="pt-BR"/>
+        </w:rPr>
         <w:t>2</w:t>
       </w:r>
       <w:r>
         <w:rPr>
           <w:rFonts w:hint="default"/>
         </w:rPr>
-        <w:t>) para construção de aplicações escaláveis e de alto desempenho no lado do servidor, oferecendo suporte a programação assíncrona e ampla compatibilidade com bibliotecas e frameworks modernos.</w:t>
+        <w:t>) para construção de aplicações escaláveis e de alto desempenho no lado do servidor, oferecendo suporte a programação assíncrona e ampla compatibilidade com bibliotecas e frameworks modernos</w:t>
+      </w:r>
+    </w:p>
+    <w:p>
+      <w:r>
+        <w:t xml:space="preserve">Ferramentas de documentação: </w:t>
+      </w:r>
+      <w:r>
+        <w:rPr>
+          <w:rFonts w:hint="default"/>
+        </w:rPr>
+        <w:t>Microsoft Word 2016 para redação do projeto e documentação formal</w:t>
+      </w:r>
+      <w:r>
+        <w:rPr>
+          <w:rFonts w:hint="default"/>
+          <w:lang w:val="pt-BR"/>
+        </w:rPr>
+        <w:t>.</w:t>
+      </w:r>
+      <w:bookmarkStart w:id="287" w:name="_GoBack"/>
+      <w:bookmarkEnd w:id="287"/>
+      <w:r>
+        <w:rPr>
+          <w:rFonts w:hint="default"/>
+        </w:rPr>
+        <w:t xml:space="preserve"> Swagger (v2.8.5) para especificação e documentação da API.</w:t>
+      </w:r>
+    </w:p>
+    <w:p>
+      <w:r>
+        <w:t>Sistema operacional: Windows 11 para ambiente de desenvolvimento e testes.</w:t>
+      </w:r>
+    </w:p>
+    <w:p>
+      <w:r>
+        <w:t>Controle de versionamento de código e repositório: Git para controle de versionamento de código e Github para hospedagem do repositório.</w:t>
+      </w:r>
+    </w:p>
+    <w:p>
+      <w:r>
+        <w:t>Ferramentas de Inteligência Artificial: GPT-4.1 nano da OpenAI para correções ortográficas e realização de tarefas repetitivas.</w:t>
+      </w:r>
+    </w:p>
+    <w:p>
+      <w:r>
+        <w:rPr>
+          <w:rFonts w:hint="default"/>
+        </w:rPr>
+        <w:t>Ferramentas de teste automatizado: JUnit (versão 5) para realização de testes unitários do código Java, garantindo a qualidade e a confiabilidade das funcionalidades implementadas.</w:t>
+      </w:r>
+    </w:p>
+    <w:p>
+      <w:pPr>
+        <w:rPr>
+          <w:rFonts w:hint="default"/>
+        </w:rPr>
+      </w:pPr>
+      <w:r>
+        <w:rPr>
+          <w:rFonts w:hint="default"/>
+        </w:rPr>
+        <w:t>Ferramentas de containerização: Docker (versão 24.0) para criação de containers isolados, possibilitando a execução consistente do sistema em diferentes ambientes e facilitando a implantação.</w:t>
       </w:r>
     </w:p>
     <w:p>
@@ -11537,6 +11550,11 @@
         <w:pStyle w:val="4"/>
       </w:pPr>
       <w:bookmarkStart w:id="32" w:name="_Toc15129"/>
+    </w:p>
+    <w:p>
+      <w:pPr>
+        <w:pStyle w:val="4"/>
+      </w:pPr>
       <w:r>
         <w:t>4.3.2 Recursos Humanos</w:t>
       </w:r>
@@ -16592,10 +16610,10 @@
       <w:pPr>
         <w:pStyle w:val="4"/>
       </w:pPr>
-      <w:bookmarkStart w:id="81" w:name="_Toc26364"/>
+      <w:bookmarkStart w:id="81" w:name="_Toc172810440"/>
       <w:bookmarkStart w:id="82" w:name="_Toc204949524"/>
-      <w:bookmarkStart w:id="83" w:name="_Toc46909558"/>
-      <w:bookmarkStart w:id="84" w:name="_Toc172810440"/>
+      <w:bookmarkStart w:id="83" w:name="_Toc26364"/>
+      <w:bookmarkStart w:id="84" w:name="_Toc46909558"/>
       <w:r>
         <w:t>6.4.3 Heurísticas de Usabilidade</w:t>
       </w:r>
@@ -16896,8 +16914,8 @@
       <w:pPr>
         <w:pStyle w:val="4"/>
       </w:pPr>
-      <w:bookmarkStart w:id="85" w:name="_Toc30104"/>
-      <w:bookmarkStart w:id="86" w:name="_Toc172810441"/>
+      <w:bookmarkStart w:id="85" w:name="_Toc172810441"/>
+      <w:bookmarkStart w:id="86" w:name="_Toc30104"/>
       <w:bookmarkStart w:id="87" w:name="_Toc204949525"/>
       <w:r>
         <w:t>6.4.4 Projeto da Acessibilidade</w:t>
@@ -17043,11 +17061,11 @@
         <w:pStyle w:val="3"/>
       </w:pPr>
       <w:bookmarkStart w:id="88" w:name="_Toc172810442"/>
-      <w:bookmarkStart w:id="89" w:name="_Toc46909559"/>
+      <w:bookmarkStart w:id="89" w:name="_Toc507747255"/>
       <w:bookmarkStart w:id="90" w:name="_Toc14345922"/>
       <w:bookmarkStart w:id="91" w:name="_Toc204949526"/>
       <w:bookmarkStart w:id="92" w:name="_Toc28863"/>
-      <w:bookmarkStart w:id="93" w:name="_Toc507747255"/>
+      <w:bookmarkStart w:id="93" w:name="_Toc46909559"/>
       <w:r>
         <w:t>6.5 PROJETO DO SISTEMA DISTRIBUÍDO</w:t>
       </w:r>
@@ -17162,9 +17180,9 @@
         <w:pStyle w:val="3"/>
       </w:pPr>
       <w:bookmarkStart w:id="100" w:name="_Toc172810446"/>
-      <w:bookmarkStart w:id="101" w:name="_Toc46909563"/>
-      <w:bookmarkStart w:id="102" w:name="_Toc204949528"/>
-      <w:bookmarkStart w:id="103" w:name="_Toc20219"/>
+      <w:bookmarkStart w:id="101" w:name="_Toc204949528"/>
+      <w:bookmarkStart w:id="102" w:name="_Toc20219"/>
+      <w:bookmarkStart w:id="103" w:name="_Toc46909563"/>
       <w:bookmarkStart w:id="104" w:name="_Toc14345918"/>
       <w:r>
         <w:t>7.1 COMPONENTES DO SISTEMA DE SOFTWARE</w:t>
@@ -17375,10 +17393,10 @@
           <w:color w:val="0000FF"/>
         </w:rPr>
       </w:pPr>
-      <w:bookmarkStart w:id="105" w:name="_Toc46909564"/>
-      <w:bookmarkStart w:id="106" w:name="_Toc172810447"/>
+      <w:bookmarkStart w:id="105" w:name="_Toc204949529"/>
+      <w:bookmarkStart w:id="106" w:name="_Toc46909564"/>
       <w:bookmarkStart w:id="107" w:name="_Toc5884"/>
-      <w:bookmarkStart w:id="108" w:name="_Toc204949529"/>
+      <w:bookmarkStart w:id="108" w:name="_Toc172810447"/>
       <w:r>
         <w:t>7.2 TECNOLOGIAS DE IMPLEMENTAÇÃO</w:t>
       </w:r>
@@ -17391,9 +17409,9 @@
       <w:pPr>
         <w:pStyle w:val="4"/>
       </w:pPr>
-      <w:bookmarkStart w:id="109" w:name="_Toc24234"/>
+      <w:bookmarkStart w:id="109" w:name="_Toc172810448"/>
       <w:bookmarkStart w:id="110" w:name="_Toc46909565"/>
-      <w:bookmarkStart w:id="111" w:name="_Toc172810448"/>
+      <w:bookmarkStart w:id="111" w:name="_Toc24234"/>
       <w:bookmarkStart w:id="112" w:name="_Toc204949530"/>
       <w:r>
         <w:t xml:space="preserve">7.2.1 Linguagens de Programação e </w:t>
@@ -17508,30 +17526,36 @@
           <w:rFonts w:hint="default"/>
           <w:i/>
           <w:iCs/>
-        </w:rPr>
-        <w:t>back-end</w:t>
-      </w:r>
-      <w:r>
-        <w:rPr>
-          <w:rFonts w:hint="default"/>
-        </w:rPr>
-        <w:t xml:space="preserve">, utiliza-se o Node.js, que fornece um ambiente de execução JavaScript eficiente e escalável, possibilitando a comunicação entre o </w:t>
-      </w:r>
-      <w:bookmarkStart w:id="287" w:name="_GoBack"/>
+          <w:lang w:val="pt-BR"/>
+        </w:rPr>
+        <w:t>front</w:t>
+      </w:r>
       <w:r>
         <w:rPr>
           <w:rFonts w:hint="default"/>
           <w:i/>
           <w:iCs/>
         </w:rPr>
-        <w:t>front-end</w:t>
-      </w:r>
-      <w:bookmarkEnd w:id="287"/>
+        <w:t>-end</w:t>
+      </w:r>
       <w:r>
         <w:rPr>
           <w:rFonts w:hint="default"/>
         </w:rPr>
-        <w:t xml:space="preserve"> e os serviços da aplicação, além de garantir maior flexibilidade na integração com bibliotecas e APIs modernas</w:t>
+        <w:t xml:space="preserve">, utiliza-se o Node.js, que fornece um ambiente de execução JavaScript eficiente e escalável, possibilitando a comunicação </w:t>
+      </w:r>
+      <w:r>
+        <w:rPr>
+          <w:rFonts w:hint="default"/>
+          <w:lang w:val="pt-BR"/>
+        </w:rPr>
+        <w:t>com</w:t>
+      </w:r>
+      <w:r>
+        <w:rPr>
+          <w:rFonts w:hint="default"/>
+        </w:rPr>
+        <w:t xml:space="preserve"> os serviços da aplicação, além de garantir maior flexibilidade na integração com bibliotecas e APIs modernas</w:t>
       </w:r>
       <w:r>
         <w:t>.</w:t>
@@ -17738,11 +17762,11 @@
         <w:pStyle w:val="4"/>
       </w:pPr>
       <w:bookmarkStart w:id="113" w:name="_Toc507747252"/>
-      <w:bookmarkStart w:id="114" w:name="_Toc204949531"/>
-      <w:bookmarkStart w:id="115" w:name="_Toc20794"/>
+      <w:bookmarkStart w:id="114" w:name="_Toc20794"/>
+      <w:bookmarkStart w:id="115" w:name="_Toc204949531"/>
       <w:bookmarkStart w:id="116" w:name="_Toc14345919"/>
-      <w:bookmarkStart w:id="117" w:name="_Toc172810449"/>
-      <w:bookmarkStart w:id="118" w:name="_Toc46909566"/>
+      <w:bookmarkStart w:id="117" w:name="_Toc46909566"/>
+      <w:bookmarkStart w:id="118" w:name="_Toc172810449"/>
       <w:r>
         <w:t xml:space="preserve">7.2.2 </w:t>
       </w:r>
@@ -18006,10 +18030,10 @@
         <w:pStyle w:val="4"/>
       </w:pPr>
       <w:bookmarkStart w:id="120" w:name="_Toc204949532"/>
-      <w:bookmarkStart w:id="121" w:name="_Toc46909567"/>
+      <w:bookmarkStart w:id="121" w:name="_Toc14345920"/>
       <w:bookmarkStart w:id="122" w:name="_Toc172810450"/>
-      <w:bookmarkStart w:id="123" w:name="_Toc14345920"/>
-      <w:bookmarkStart w:id="124" w:name="_Toc25265"/>
+      <w:bookmarkStart w:id="123" w:name="_Toc25265"/>
+      <w:bookmarkStart w:id="124" w:name="_Toc46909567"/>
       <w:r>
         <w:t>7.2.3 Convenções e Guias para Codificação</w:t>
       </w:r>
@@ -18398,8 +18422,8 @@
       </w:pPr>
       <w:bookmarkStart w:id="125" w:name="_Toc204949533"/>
       <w:bookmarkStart w:id="126" w:name="_Toc24842"/>
-      <w:bookmarkStart w:id="127" w:name="_Toc507747250"/>
-      <w:bookmarkStart w:id="128" w:name="_Toc46909568"/>
+      <w:bookmarkStart w:id="127" w:name="_Toc46909568"/>
+      <w:bookmarkStart w:id="128" w:name="_Toc507747250"/>
       <w:bookmarkStart w:id="129" w:name="_Toc14345915"/>
       <w:bookmarkStart w:id="130" w:name="_Toc172810451"/>
       <w:r>
@@ -18434,9 +18458,9 @@
           <w:color w:val="0000FF"/>
         </w:rPr>
       </w:pPr>
-      <w:bookmarkStart w:id="131" w:name="_Toc172810452"/>
-      <w:bookmarkStart w:id="132" w:name="_Toc204949534"/>
-      <w:bookmarkStart w:id="133" w:name="_Toc46909569"/>
+      <w:bookmarkStart w:id="131" w:name="_Toc204949534"/>
+      <w:bookmarkStart w:id="132" w:name="_Toc46909569"/>
+      <w:bookmarkStart w:id="133" w:name="_Toc172810452"/>
       <w:bookmarkStart w:id="134" w:name="_Toc17202"/>
       <w:bookmarkStart w:id="135" w:name="_Toc14345921"/>
       <w:r>
@@ -18653,11 +18677,11 @@
         <w:pStyle w:val="2"/>
       </w:pPr>
       <w:bookmarkStart w:id="136" w:name="_Toc204949535"/>
-      <w:bookmarkStart w:id="137" w:name="_Toc172810453"/>
-      <w:bookmarkStart w:id="138" w:name="_Toc507747262"/>
+      <w:bookmarkStart w:id="137" w:name="_Toc507747262"/>
+      <w:bookmarkStart w:id="138" w:name="_Toc172810453"/>
       <w:bookmarkStart w:id="139" w:name="_Toc25807"/>
-      <w:bookmarkStart w:id="140" w:name="_Toc46909570"/>
-      <w:bookmarkStart w:id="141" w:name="_Toc14345929"/>
+      <w:bookmarkStart w:id="140" w:name="_Toc14345929"/>
+      <w:bookmarkStart w:id="141" w:name="_Toc46909570"/>
       <w:r>
         <w:t>8 PLANO DE TESTES</w:t>
       </w:r>
@@ -18693,10 +18717,10 @@
           <w:rFonts w:eastAsia="Arial Unicode MS"/>
         </w:rPr>
       </w:pPr>
-      <w:bookmarkStart w:id="142" w:name="_Toc172810454"/>
-      <w:bookmarkStart w:id="143" w:name="_Toc14345930"/>
-      <w:bookmarkStart w:id="144" w:name="_Toc507747263"/>
-      <w:bookmarkStart w:id="145" w:name="_Toc18606"/>
+      <w:bookmarkStart w:id="142" w:name="_Toc14345930"/>
+      <w:bookmarkStart w:id="143" w:name="_Toc507747263"/>
+      <w:bookmarkStart w:id="144" w:name="_Toc18606"/>
+      <w:bookmarkStart w:id="145" w:name="_Toc172810454"/>
       <w:bookmarkStart w:id="146" w:name="_Toc204949536"/>
       <w:bookmarkStart w:id="147" w:name="_Toc46909571"/>
       <w:r>
@@ -18956,8 +18980,8 @@
         </w:rPr>
       </w:pPr>
       <w:bookmarkStart w:id="148" w:name="_Toc14345931"/>
-      <w:bookmarkStart w:id="149" w:name="_Toc172810455"/>
-      <w:bookmarkStart w:id="150" w:name="_Toc46909572"/>
+      <w:bookmarkStart w:id="149" w:name="_Toc46909572"/>
+      <w:bookmarkStart w:id="150" w:name="_Toc172810455"/>
       <w:bookmarkStart w:id="151" w:name="_Toc507747264"/>
       <w:bookmarkStart w:id="152" w:name="_Toc204949537"/>
     </w:p>
@@ -19245,11 +19269,11 @@
       <w:pPr>
         <w:pStyle w:val="4"/>
       </w:pPr>
-      <w:bookmarkStart w:id="154" w:name="_Toc14345932"/>
-      <w:bookmarkStart w:id="155" w:name="_Toc46909573"/>
-      <w:bookmarkStart w:id="156" w:name="_Toc204949538"/>
-      <w:bookmarkStart w:id="157" w:name="_Toc172810456"/>
-      <w:bookmarkStart w:id="158" w:name="_Toc14606"/>
+      <w:bookmarkStart w:id="154" w:name="_Toc46909573"/>
+      <w:bookmarkStart w:id="155" w:name="_Toc204949538"/>
+      <w:bookmarkStart w:id="156" w:name="_Toc172810456"/>
+      <w:bookmarkStart w:id="157" w:name="_Toc14606"/>
+      <w:bookmarkStart w:id="158" w:name="_Toc14345932"/>
       <w:bookmarkStart w:id="159" w:name="_Toc507747265"/>
       <w:r>
         <w:t>8.2.1 Referências aos Documentos Relevantes</w:t>
@@ -19477,9 +19501,9 @@
       <w:r>
         <w:t xml:space="preserve">   </w:t>
       </w:r>
-      <w:bookmarkStart w:id="162" w:name="_Toc204949481"/>
-      <w:bookmarkStart w:id="163" w:name="_Toc172810391"/>
-      <w:bookmarkStart w:id="164" w:name="_Toc78782581"/>
+      <w:bookmarkStart w:id="162" w:name="_Toc172810391"/>
+      <w:bookmarkStart w:id="163" w:name="_Toc78782581"/>
+      <w:bookmarkStart w:id="164" w:name="_Toc204949481"/>
       <w:r>
         <w:t xml:space="preserve">QUADRO </w:t>
       </w:r>
@@ -19882,8 +19906,8 @@
       </w:r>
       <w:bookmarkStart w:id="172" w:name="_Toc14343276"/>
       <w:bookmarkStart w:id="173" w:name="_Toc204949482"/>
-      <w:bookmarkStart w:id="174" w:name="_Toc507751105"/>
-      <w:bookmarkStart w:id="175" w:name="_Toc172810392"/>
+      <w:bookmarkStart w:id="174" w:name="_Toc172810392"/>
+      <w:bookmarkStart w:id="175" w:name="_Toc507751105"/>
       <w:bookmarkStart w:id="176" w:name="_Toc78782582"/>
       <w:r>
         <w:t xml:space="preserve">QUADRO </w:t>
@@ -20257,10 +20281,10 @@
         </w:rPr>
         <w:t xml:space="preserve">   </w:t>
       </w:r>
-      <w:bookmarkStart w:id="178" w:name="_Toc78782583"/>
-      <w:bookmarkStart w:id="179" w:name="_Toc14343277"/>
-      <w:bookmarkStart w:id="180" w:name="_Toc507751106"/>
-      <w:bookmarkStart w:id="181" w:name="_Toc172810393"/>
+      <w:bookmarkStart w:id="178" w:name="_Toc14343277"/>
+      <w:bookmarkStart w:id="179" w:name="_Toc507751106"/>
+      <w:bookmarkStart w:id="180" w:name="_Toc172810393"/>
+      <w:bookmarkStart w:id="181" w:name="_Toc78782583"/>
       <w:bookmarkStart w:id="182" w:name="_Toc204949483"/>
       <w:r>
         <w:t xml:space="preserve">QUADRO </w:t>
@@ -20308,9 +20332,9 @@
       </w:pPr>
       <w:bookmarkStart w:id="183" w:name="_Toc11777"/>
       <w:bookmarkStart w:id="184" w:name="_Toc14345934"/>
-      <w:bookmarkStart w:id="185" w:name="_Toc172810458"/>
-      <w:bookmarkStart w:id="186" w:name="_Toc204949540"/>
-      <w:bookmarkStart w:id="187" w:name="_Toc46909575"/>
+      <w:bookmarkStart w:id="185" w:name="_Toc204949540"/>
+      <w:bookmarkStart w:id="186" w:name="_Toc46909575"/>
+      <w:bookmarkStart w:id="187" w:name="_Toc172810458"/>
       <w:bookmarkStart w:id="188" w:name="_Toc507747267"/>
       <w:r>
         <w:t>8.3 ESPECIFICAÇÃO DOS CASOS DE TESTES</w:t>
@@ -20335,8 +20359,8 @@
           <w:color w:val="0000FF"/>
         </w:rPr>
       </w:pPr>
-      <w:bookmarkStart w:id="189" w:name="_Toc14345938"/>
-      <w:bookmarkStart w:id="190" w:name="_Toc46909579"/>
+      <w:bookmarkStart w:id="189" w:name="_Toc46909579"/>
+      <w:bookmarkStart w:id="190" w:name="_Toc14345938"/>
       <w:bookmarkStart w:id="191" w:name="_Toc507747271"/>
     </w:p>
     <w:p>
@@ -20384,9 +20408,9 @@
       </w:pPr>
       <w:bookmarkStart w:id="195" w:name="_Toc507747274"/>
       <w:bookmarkStart w:id="196" w:name="_Toc204949542"/>
-      <w:bookmarkStart w:id="197" w:name="_Toc14345941"/>
-      <w:bookmarkStart w:id="198" w:name="_Toc172810460"/>
-      <w:bookmarkStart w:id="199" w:name="_Toc46909582"/>
+      <w:bookmarkStart w:id="197" w:name="_Toc172810460"/>
+      <w:bookmarkStart w:id="198" w:name="_Toc46909582"/>
+      <w:bookmarkStart w:id="199" w:name="_Toc14345941"/>
       <w:r>
         <w:rPr>
           <w:color w:val="0000FF"/>
@@ -20445,11 +20469,11 @@
           <w:color w:val="0000FF"/>
         </w:rPr>
       </w:pPr>
-      <w:bookmarkStart w:id="201" w:name="_Toc14345942"/>
+      <w:bookmarkStart w:id="201" w:name="_Toc46909583"/>
       <w:bookmarkStart w:id="202" w:name="_Toc204949543"/>
       <w:bookmarkStart w:id="203" w:name="_Toc507747275"/>
-      <w:bookmarkStart w:id="204" w:name="_Toc28810"/>
-      <w:bookmarkStart w:id="205" w:name="_Toc46909583"/>
+      <w:bookmarkStart w:id="204" w:name="_Toc14345942"/>
+      <w:bookmarkStart w:id="205" w:name="_Toc28810"/>
       <w:bookmarkStart w:id="206" w:name="_Toc172810461"/>
       <w:r>
         <w:rPr>
@@ -20496,12 +20520,12 @@
       <w:pPr>
         <w:pStyle w:val="4"/>
       </w:pPr>
-      <w:bookmarkStart w:id="207" w:name="_Toc14345943"/>
-      <w:bookmarkStart w:id="208" w:name="_Toc12632"/>
-      <w:bookmarkStart w:id="209" w:name="_Toc204949544"/>
-      <w:bookmarkStart w:id="210" w:name="_Toc172810462"/>
-      <w:bookmarkStart w:id="211" w:name="_Toc46909584"/>
-      <w:bookmarkStart w:id="212" w:name="_Toc507747276"/>
+      <w:bookmarkStart w:id="207" w:name="_Toc172810462"/>
+      <w:bookmarkStart w:id="208" w:name="_Toc46909584"/>
+      <w:bookmarkStart w:id="209" w:name="_Toc507747276"/>
+      <w:bookmarkStart w:id="210" w:name="_Toc204949544"/>
+      <w:bookmarkStart w:id="211" w:name="_Toc12632"/>
+      <w:bookmarkStart w:id="212" w:name="_Toc14345943"/>
       <w:r>
         <w:t>9.1.1 Descrição da Metodologia</w:t>
       </w:r>
@@ -20537,11 +20561,11 @@
         <w:pStyle w:val="4"/>
       </w:pPr>
       <w:bookmarkStart w:id="213" w:name="_Toc507747277"/>
-      <w:bookmarkStart w:id="214" w:name="_Toc204949545"/>
-      <w:bookmarkStart w:id="215" w:name="_Toc13586"/>
-      <w:bookmarkStart w:id="216" w:name="_Toc172810463"/>
-      <w:bookmarkStart w:id="217" w:name="_Toc14345944"/>
-      <w:bookmarkStart w:id="218" w:name="_Toc46909585"/>
+      <w:bookmarkStart w:id="214" w:name="_Toc14345944"/>
+      <w:bookmarkStart w:id="215" w:name="_Toc172810463"/>
+      <w:bookmarkStart w:id="216" w:name="_Toc13586"/>
+      <w:bookmarkStart w:id="217" w:name="_Toc46909585"/>
+      <w:bookmarkStart w:id="218" w:name="_Toc204949545"/>
       <w:r>
         <w:t>9.1.2 Matriz de Responsabilidade</w:t>
       </w:r>
@@ -21687,11 +21711,11 @@
           <w:color w:val="0000FF"/>
         </w:rPr>
       </w:pPr>
-      <w:bookmarkStart w:id="219" w:name="_Toc78782587"/>
-      <w:bookmarkStart w:id="220" w:name="_Toc204949484"/>
-      <w:bookmarkStart w:id="221" w:name="_Toc507751111"/>
+      <w:bookmarkStart w:id="219" w:name="_Toc507751111"/>
+      <w:bookmarkStart w:id="220" w:name="_Toc78782587"/>
+      <w:bookmarkStart w:id="221" w:name="_Toc14343281"/>
       <w:bookmarkStart w:id="222" w:name="_Toc172810394"/>
-      <w:bookmarkStart w:id="223" w:name="_Toc14343281"/>
+      <w:bookmarkStart w:id="223" w:name="_Toc204949484"/>
       <w:r>
         <w:rPr>
           <w:color w:val="0000FF"/>
@@ -21754,12 +21778,12 @@
           <w:color w:val="0000FF"/>
         </w:rPr>
       </w:pPr>
-      <w:bookmarkStart w:id="224" w:name="_Toc13797"/>
-      <w:bookmarkStart w:id="225" w:name="_Toc172810464"/>
-      <w:bookmarkStart w:id="226" w:name="_Toc14345945"/>
-      <w:bookmarkStart w:id="227" w:name="_Toc204949546"/>
-      <w:bookmarkStart w:id="228" w:name="_Toc46909586"/>
-      <w:bookmarkStart w:id="229" w:name="_Toc507747278"/>
+      <w:bookmarkStart w:id="224" w:name="_Toc172810464"/>
+      <w:bookmarkStart w:id="225" w:name="_Toc46909586"/>
+      <w:bookmarkStart w:id="226" w:name="_Toc507747278"/>
+      <w:bookmarkStart w:id="227" w:name="_Toc13797"/>
+      <w:bookmarkStart w:id="228" w:name="_Toc14345945"/>
+      <w:bookmarkStart w:id="229" w:name="_Toc204949546"/>
       <w:r>
         <w:rPr>
           <w:color w:val="0000FF"/>
@@ -21971,11 +21995,11 @@
           <w:color w:val="0000FF"/>
         </w:rPr>
       </w:pPr>
-      <w:bookmarkStart w:id="230" w:name="_Toc172810395"/>
-      <w:bookmarkStart w:id="231" w:name="_Toc204949485"/>
-      <w:bookmarkStart w:id="232" w:name="_Toc14343282"/>
-      <w:bookmarkStart w:id="233" w:name="_Toc507751112"/>
-      <w:bookmarkStart w:id="234" w:name="_Toc78782588"/>
+      <w:bookmarkStart w:id="230" w:name="_Toc78782588"/>
+      <w:bookmarkStart w:id="231" w:name="_Toc172810395"/>
+      <w:bookmarkStart w:id="232" w:name="_Toc507751112"/>
+      <w:bookmarkStart w:id="233" w:name="_Toc204949485"/>
+      <w:bookmarkStart w:id="234" w:name="_Toc14343282"/>
       <w:r>
         <w:rPr>
           <w:color w:val="0000FF"/>
@@ -22039,11 +22063,11 @@
           <w:color w:val="0000FF"/>
         </w:rPr>
       </w:pPr>
-      <w:bookmarkStart w:id="235" w:name="_Toc46909587"/>
+      <w:bookmarkStart w:id="235" w:name="_Toc172810465"/>
       <w:bookmarkStart w:id="236" w:name="_Toc13337"/>
-      <w:bookmarkStart w:id="237" w:name="_Toc204949547"/>
-      <w:bookmarkStart w:id="238" w:name="_Toc172810465"/>
-      <w:bookmarkStart w:id="239" w:name="_Toc507747279"/>
+      <w:bookmarkStart w:id="237" w:name="_Toc46909587"/>
+      <w:bookmarkStart w:id="238" w:name="_Toc507747279"/>
+      <w:bookmarkStart w:id="239" w:name="_Toc204949547"/>
       <w:bookmarkStart w:id="240" w:name="_Toc14345946"/>
       <w:r>
         <w:rPr>
@@ -22262,12 +22286,6 @@
             <w:insideH w:val="single" w:color="auto" w:sz="4" w:space="0"/>
             <w:insideV w:val="single" w:color="auto" w:sz="4" w:space="0"/>
           </w:tblBorders>
-          <w:tblCellMar>
-            <w:top w:w="0" w:type="dxa"/>
-            <w:left w:w="70" w:type="dxa"/>
-            <w:bottom w:w="0" w:type="dxa"/>
-            <w:right w:w="70" w:type="dxa"/>
-          </w:tblCellMar>
         </w:tblPrEx>
         <w:trPr>
           <w:trHeight w:val="300" w:hRule="atLeast"/>
@@ -22317,11 +22335,11 @@
           <w:color w:val="0000FF"/>
         </w:rPr>
       </w:pPr>
-      <w:bookmarkStart w:id="241" w:name="_Toc172810396"/>
-      <w:bookmarkStart w:id="242" w:name="_Toc204949486"/>
-      <w:bookmarkStart w:id="243" w:name="_Toc14343283"/>
+      <w:bookmarkStart w:id="241" w:name="_Toc204949486"/>
+      <w:bookmarkStart w:id="242" w:name="_Toc172810396"/>
+      <w:bookmarkStart w:id="243" w:name="_Toc507751113"/>
       <w:bookmarkStart w:id="244" w:name="_Toc78782589"/>
-      <w:bookmarkStart w:id="245" w:name="_Toc507751113"/>
+      <w:bookmarkStart w:id="245" w:name="_Toc14343283"/>
       <w:r>
         <w:rPr>
           <w:color w:val="0000FF"/>
@@ -22385,12 +22403,12 @@
           <w:color w:val="0000FF"/>
         </w:rPr>
       </w:pPr>
-      <w:bookmarkStart w:id="246" w:name="_Toc172810466"/>
-      <w:bookmarkStart w:id="247" w:name="_Toc14345947"/>
+      <w:bookmarkStart w:id="246" w:name="_Toc204949548"/>
+      <w:bookmarkStart w:id="247" w:name="_Toc46909588"/>
       <w:bookmarkStart w:id="248" w:name="_Toc507747280"/>
-      <w:bookmarkStart w:id="249" w:name="_Toc2408"/>
-      <w:bookmarkStart w:id="250" w:name="_Toc46909588"/>
-      <w:bookmarkStart w:id="251" w:name="_Toc204949548"/>
+      <w:bookmarkStart w:id="249" w:name="_Toc172810466"/>
+      <w:bookmarkStart w:id="250" w:name="_Toc2408"/>
+      <w:bookmarkStart w:id="251" w:name="_Toc14345947"/>
       <w:r>
         <w:rPr>
           <w:color w:val="0000FF"/>
@@ -22736,11 +22754,11 @@
           <w:color w:val="0000FF"/>
         </w:rPr>
       </w:pPr>
-      <w:bookmarkStart w:id="252" w:name="_Toc507751114"/>
-      <w:bookmarkStart w:id="253" w:name="_Toc204949487"/>
-      <w:bookmarkStart w:id="254" w:name="_Toc172810397"/>
-      <w:bookmarkStart w:id="255" w:name="_Toc78782590"/>
-      <w:bookmarkStart w:id="256" w:name="_Toc14343284"/>
+      <w:bookmarkStart w:id="252" w:name="_Toc172810397"/>
+      <w:bookmarkStart w:id="253" w:name="_Toc507751114"/>
+      <w:bookmarkStart w:id="254" w:name="_Toc78782590"/>
+      <w:bookmarkStart w:id="255" w:name="_Toc14343284"/>
+      <w:bookmarkStart w:id="256" w:name="_Toc204949487"/>
       <w:r>
         <w:rPr>
           <w:color w:val="0000FF"/>
@@ -22804,12 +22822,12 @@
           <w:color w:val="0000FF"/>
         </w:rPr>
       </w:pPr>
-      <w:bookmarkStart w:id="257" w:name="_Toc172810467"/>
+      <w:bookmarkStart w:id="257" w:name="_Toc14345948"/>
       <w:bookmarkStart w:id="258" w:name="_Toc507747281"/>
       <w:bookmarkStart w:id="259" w:name="_Toc25573"/>
       <w:bookmarkStart w:id="260" w:name="_Toc46909589"/>
       <w:bookmarkStart w:id="261" w:name="_Toc204949549"/>
-      <w:bookmarkStart w:id="262" w:name="_Toc14345948"/>
+      <w:bookmarkStart w:id="262" w:name="_Toc172810467"/>
       <w:r>
         <w:rPr>
           <w:color w:val="0000FF"/>
@@ -23554,8 +23572,8 @@
         <w:br w:type="page"/>
       </w:r>
       <w:bookmarkStart w:id="269" w:name="_Toc10367"/>
-      <w:bookmarkStart w:id="270" w:name="_Toc192060122"/>
-      <w:bookmarkStart w:id="271" w:name="_Toc284603410"/>
+      <w:bookmarkStart w:id="270" w:name="_Toc284603410"/>
+      <w:bookmarkStart w:id="271" w:name="_Toc192060122"/>
       <w:r>
         <w:t>APÊNDICE B – RELATÓRIO DE DESEMPENHO</w:t>
       </w:r>
@@ -23686,8 +23704,8 @@
       <w:pPr>
         <w:pStyle w:val="2"/>
       </w:pPr>
-      <w:bookmarkStart w:id="277" w:name="_Toc204949560"/>
-      <w:bookmarkStart w:id="278" w:name="_Toc2688"/>
+      <w:bookmarkStart w:id="277" w:name="_Toc2688"/>
+      <w:bookmarkStart w:id="278" w:name="_Toc204949560"/>
       <w:r>
         <w:t>APÊNDICE H – MODELO DE NEGÓCIO</w:t>
       </w:r>
@@ -23708,8 +23726,8 @@
       <w:pPr>
         <w:pStyle w:val="2"/>
       </w:pPr>
-      <w:bookmarkStart w:id="279" w:name="_Toc204949561"/>
-      <w:bookmarkStart w:id="280" w:name="_Toc13207"/>
+      <w:bookmarkStart w:id="279" w:name="_Toc13207"/>
+      <w:bookmarkStart w:id="280" w:name="_Toc204949561"/>
       <w:bookmarkStart w:id="281" w:name="_Toc172810480"/>
       <w:r>
         <w:rPr>
@@ -23744,8 +23762,8 @@
       <w:pPr>
         <w:pStyle w:val="2"/>
       </w:pPr>
-      <w:bookmarkStart w:id="282" w:name="_Toc204949562"/>
-      <w:bookmarkStart w:id="283" w:name="_Toc23905"/>
+      <w:bookmarkStart w:id="282" w:name="_Toc23905"/>
+      <w:bookmarkStart w:id="283" w:name="_Toc204949562"/>
       <w:r>
         <w:t>APÊNDICE J – CASOS DE TESTES</w:t>
       </w:r>
@@ -23767,9 +23785,9 @@
       <w:pPr>
         <w:pStyle w:val="2"/>
       </w:pPr>
-      <w:bookmarkStart w:id="284" w:name="_Toc204949563"/>
-      <w:bookmarkStart w:id="285" w:name="_Toc4481"/>
-      <w:bookmarkStart w:id="286" w:name="_Toc172810481"/>
+      <w:bookmarkStart w:id="284" w:name="_Toc172810481"/>
+      <w:bookmarkStart w:id="285" w:name="_Toc204949563"/>
+      <w:bookmarkStart w:id="286" w:name="_Toc4481"/>
       <w:r>
         <w:t>APÊNDICE K – RECURSOS DE APOIO À IMPLANTAÇÃO</w:t>
       </w:r>

</xml_diff>

<commit_message>
feat: implementacao da criacao de usuarios administradores
</commit_message>
<xml_diff>
--- a/docs/SAGE_PFC_v1.18.docx
+++ b/docs/SAGE_PFC_v1.18.docx
@@ -668,6 +668,12 @@
             <w:insideH w:val="single" w:color="000000" w:sz="6" w:space="0"/>
             <w:insideV w:val="single" w:color="000000" w:sz="6" w:space="0"/>
           </w:tblBorders>
+          <w:tblCellMar>
+            <w:top w:w="0" w:type="dxa"/>
+            <w:left w:w="10" w:type="dxa"/>
+            <w:bottom w:w="0" w:type="dxa"/>
+            <w:right w:w="10" w:type="dxa"/>
+          </w:tblCellMar>
         </w:tblPrEx>
         <w:tc>
           <w:tcPr>
@@ -3483,8 +3489,6 @@
       <w:r>
         <w:fldChar w:fldCharType="end"/>
       </w:r>
-      <w:bookmarkStart w:id="287" w:name="_GoBack"/>
-      <w:bookmarkEnd w:id="287"/>
     </w:p>
     <w:p>
       <w:pPr>
@@ -15282,21 +15286,24 @@
           <w:tab w:val="clear" w:pos="1260"/>
         </w:tabs>
         <w:ind w:left="1265" w:hanging="425"/>
-        <w:rPr>
-          <w:highlight w:val="yellow"/>
-        </w:rPr>
-      </w:pPr>
-      <w:r>
-        <w:t xml:space="preserve">SSEService: </w:t>
-      </w:r>
+      </w:pPr>
       <w:r>
         <w:rPr>
           <w:rFonts w:hint="default"/>
         </w:rPr>
+        <w:t>S</w:t>
+      </w:r>
+      <w:r>
+        <w:t xml:space="preserve">SEService: </w:t>
+      </w:r>
+      <w:r>
+        <w:rPr>
+          <w:rFonts w:hint="default"/>
+        </w:rPr>
         <w:t>Server-Sent Events (SSE), uma tecnologia web para comunicação em tempo real entre servidor</w:t>
       </w:r>
       <w:r>
-        <w:t xml:space="preserve">. </w:t>
+        <w:t>.</w:t>
       </w:r>
     </w:p>
     <w:p>
@@ -15310,6 +15317,8 @@
         </w:tabs>
         <w:ind w:left="845" w:hanging="425"/>
       </w:pPr>
+      <w:bookmarkStart w:id="287" w:name="_GoBack"/>
+      <w:bookmarkEnd w:id="287"/>
       <w:r>
         <w:t xml:space="preserve">DTO: Agrupa os </w:t>
       </w:r>
@@ -16781,10 +16790,10 @@
       <w:pPr>
         <w:pStyle w:val="4"/>
       </w:pPr>
-      <w:bookmarkStart w:id="81" w:name="_Toc172810440"/>
-      <w:bookmarkStart w:id="82" w:name="_Toc46909558"/>
-      <w:bookmarkStart w:id="83" w:name="_Toc26364"/>
-      <w:bookmarkStart w:id="84" w:name="_Toc204949524"/>
+      <w:bookmarkStart w:id="81" w:name="_Toc26364"/>
+      <w:bookmarkStart w:id="82" w:name="_Toc172810440"/>
+      <w:bookmarkStart w:id="83" w:name="_Toc204949524"/>
+      <w:bookmarkStart w:id="84" w:name="_Toc46909558"/>
       <w:r>
         <w:drawing>
           <wp:inline distT="0" distB="0" distL="114300" distR="114300">
@@ -17582,8 +17591,8 @@
       <w:pPr>
         <w:pStyle w:val="4"/>
       </w:pPr>
-      <w:bookmarkStart w:id="85" w:name="_Toc30104"/>
-      <w:bookmarkStart w:id="86" w:name="_Toc172810441"/>
+      <w:bookmarkStart w:id="85" w:name="_Toc172810441"/>
+      <w:bookmarkStart w:id="86" w:name="_Toc30104"/>
       <w:bookmarkStart w:id="87" w:name="_Toc204949525"/>
       <w:r>
         <w:t>6.4.4 Projeto da Acessibilidade</w:t>
@@ -17729,11 +17738,11 @@
         <w:pStyle w:val="3"/>
       </w:pPr>
       <w:bookmarkStart w:id="88" w:name="_Toc507747255"/>
-      <w:bookmarkStart w:id="89" w:name="_Toc204949526"/>
-      <w:bookmarkStart w:id="90" w:name="_Toc14345922"/>
-      <w:bookmarkStart w:id="91" w:name="_Toc172810442"/>
-      <w:bookmarkStart w:id="92" w:name="_Toc46909559"/>
-      <w:bookmarkStart w:id="93" w:name="_Toc28863"/>
+      <w:bookmarkStart w:id="89" w:name="_Toc172810442"/>
+      <w:bookmarkStart w:id="90" w:name="_Toc28863"/>
+      <w:bookmarkStart w:id="91" w:name="_Toc14345922"/>
+      <w:bookmarkStart w:id="92" w:name="_Toc204949526"/>
+      <w:bookmarkStart w:id="93" w:name="_Toc46909559"/>
       <w:r>
         <w:t>6.5 PROJETO DO SISTEMA DISTRIBUÍDO</w:t>
       </w:r>
@@ -17766,8 +17775,8 @@
           <w:kern w:val="32"/>
         </w:rPr>
       </w:pPr>
-      <w:bookmarkStart w:id="94" w:name="_Toc46909562"/>
-      <w:bookmarkStart w:id="95" w:name="_Toc172810445"/>
+      <w:bookmarkStart w:id="94" w:name="_Toc172810445"/>
+      <w:bookmarkStart w:id="95" w:name="_Toc46909562"/>
       <w:bookmarkStart w:id="96" w:name="_Toc204949527"/>
       <w:bookmarkStart w:id="97" w:name="_Toc14345916"/>
       <w:r>
@@ -18061,8 +18070,8 @@
           <w:color w:val="0000FF"/>
         </w:rPr>
       </w:pPr>
-      <w:bookmarkStart w:id="105" w:name="_Toc204949529"/>
-      <w:bookmarkStart w:id="106" w:name="_Toc5884"/>
+      <w:bookmarkStart w:id="105" w:name="_Toc5884"/>
+      <w:bookmarkStart w:id="106" w:name="_Toc204949529"/>
       <w:bookmarkStart w:id="107" w:name="_Toc172810447"/>
       <w:bookmarkStart w:id="108" w:name="_Toc46909564"/>
       <w:r>
@@ -18077,10 +18086,10 @@
       <w:pPr>
         <w:pStyle w:val="4"/>
       </w:pPr>
-      <w:bookmarkStart w:id="109" w:name="_Toc172810448"/>
-      <w:bookmarkStart w:id="110" w:name="_Toc204949530"/>
-      <w:bookmarkStart w:id="111" w:name="_Toc24234"/>
-      <w:bookmarkStart w:id="112" w:name="_Toc46909565"/>
+      <w:bookmarkStart w:id="109" w:name="_Toc204949530"/>
+      <w:bookmarkStart w:id="110" w:name="_Toc46909565"/>
+      <w:bookmarkStart w:id="111" w:name="_Toc172810448"/>
+      <w:bookmarkStart w:id="112" w:name="_Toc24234"/>
       <w:r>
         <w:t xml:space="preserve">7.2.1 Linguagens de Programação e </w:t>
       </w:r>
@@ -18430,9 +18439,9 @@
         <w:pStyle w:val="4"/>
       </w:pPr>
       <w:bookmarkStart w:id="113" w:name="_Toc507747252"/>
-      <w:bookmarkStart w:id="114" w:name="_Toc20794"/>
+      <w:bookmarkStart w:id="114" w:name="_Toc14345919"/>
       <w:bookmarkStart w:id="115" w:name="_Toc204949531"/>
-      <w:bookmarkStart w:id="116" w:name="_Toc14345919"/>
+      <w:bookmarkStart w:id="116" w:name="_Toc20794"/>
       <w:bookmarkStart w:id="117" w:name="_Toc172810449"/>
       <w:bookmarkStart w:id="118" w:name="_Toc46909566"/>
       <w:r>
@@ -19126,11 +19135,11 @@
           <w:color w:val="0000FF"/>
         </w:rPr>
       </w:pPr>
-      <w:bookmarkStart w:id="131" w:name="_Toc14345921"/>
+      <w:bookmarkStart w:id="131" w:name="_Toc204949534"/>
       <w:bookmarkStart w:id="132" w:name="_Toc17202"/>
       <w:bookmarkStart w:id="133" w:name="_Toc46909569"/>
-      <w:bookmarkStart w:id="134" w:name="_Toc204949534"/>
-      <w:bookmarkStart w:id="135" w:name="_Toc172810452"/>
+      <w:bookmarkStart w:id="134" w:name="_Toc172810452"/>
+      <w:bookmarkStart w:id="135" w:name="_Toc14345921"/>
       <w:r>
         <w:t>7.3 ANÁLISE DE COMPLEXIDADE ALGORÍTMICA</w:t>
       </w:r>
@@ -19344,12 +19353,12 @@
       <w:pPr>
         <w:pStyle w:val="2"/>
       </w:pPr>
-      <w:bookmarkStart w:id="136" w:name="_Toc507747262"/>
-      <w:bookmarkStart w:id="137" w:name="_Toc46909570"/>
-      <w:bookmarkStart w:id="138" w:name="_Toc25807"/>
+      <w:bookmarkStart w:id="136" w:name="_Toc14345929"/>
+      <w:bookmarkStart w:id="137" w:name="_Toc204949535"/>
+      <w:bookmarkStart w:id="138" w:name="_Toc507747262"/>
       <w:bookmarkStart w:id="139" w:name="_Toc172810453"/>
-      <w:bookmarkStart w:id="140" w:name="_Toc14345929"/>
-      <w:bookmarkStart w:id="141" w:name="_Toc204949535"/>
+      <w:bookmarkStart w:id="140" w:name="_Toc25807"/>
+      <w:bookmarkStart w:id="141" w:name="_Toc46909570"/>
       <w:r>
         <w:t>8 PLANO DE TESTES</w:t>
       </w:r>
@@ -19647,11 +19656,11 @@
           <w:rFonts w:eastAsia="Arial Unicode MS"/>
         </w:rPr>
       </w:pPr>
-      <w:bookmarkStart w:id="148" w:name="_Toc14345931"/>
-      <w:bookmarkStart w:id="149" w:name="_Toc46909572"/>
-      <w:bookmarkStart w:id="150" w:name="_Toc172810455"/>
+      <w:bookmarkStart w:id="148" w:name="_Toc46909572"/>
+      <w:bookmarkStart w:id="149" w:name="_Toc14345931"/>
+      <w:bookmarkStart w:id="150" w:name="_Toc507747264"/>
       <w:bookmarkStart w:id="151" w:name="_Toc204949537"/>
-      <w:bookmarkStart w:id="152" w:name="_Toc507747264"/>
+      <w:bookmarkStart w:id="152" w:name="_Toc172810455"/>
     </w:p>
     <w:p>
       <w:pPr>
@@ -19937,12 +19946,12 @@
       <w:pPr>
         <w:pStyle w:val="4"/>
       </w:pPr>
-      <w:bookmarkStart w:id="154" w:name="_Toc507747265"/>
+      <w:bookmarkStart w:id="154" w:name="_Toc204949538"/>
       <w:bookmarkStart w:id="155" w:name="_Toc14345932"/>
       <w:bookmarkStart w:id="156" w:name="_Toc172810456"/>
       <w:bookmarkStart w:id="157" w:name="_Toc46909573"/>
       <w:bookmarkStart w:id="158" w:name="_Toc14606"/>
-      <w:bookmarkStart w:id="159" w:name="_Toc204949538"/>
+      <w:bookmarkStart w:id="159" w:name="_Toc507747265"/>
       <w:r>
         <w:t>8.2.1 Referências aos Documentos Relevantes</w:t>
       </w:r>
@@ -20169,9 +20178,9 @@
       <w:r>
         <w:t xml:space="preserve">   </w:t>
       </w:r>
-      <w:bookmarkStart w:id="162" w:name="_Toc172810391"/>
-      <w:bookmarkStart w:id="163" w:name="_Toc78782581"/>
-      <w:bookmarkStart w:id="164" w:name="_Toc204949481"/>
+      <w:bookmarkStart w:id="162" w:name="_Toc204949481"/>
+      <w:bookmarkStart w:id="163" w:name="_Toc172810391"/>
+      <w:bookmarkStart w:id="164" w:name="_Toc78782581"/>
       <w:r>
         <w:t xml:space="preserve">QUADRO </w:t>
       </w:r>
@@ -20213,11 +20222,11 @@
       </w:pPr>
       <w:bookmarkStart w:id="165" w:name="_Toc191128985"/>
       <w:bookmarkStart w:id="166" w:name="_Toc22317"/>
-      <w:bookmarkStart w:id="167" w:name="_Toc14345933"/>
-      <w:bookmarkStart w:id="168" w:name="_Toc204949539"/>
-      <w:bookmarkStart w:id="169" w:name="_Toc507747266"/>
-      <w:bookmarkStart w:id="170" w:name="_Toc172810457"/>
-      <w:bookmarkStart w:id="171" w:name="_Toc46909574"/>
+      <w:bookmarkStart w:id="167" w:name="_Toc172810457"/>
+      <w:bookmarkStart w:id="168" w:name="_Toc46909574"/>
+      <w:bookmarkStart w:id="169" w:name="_Toc204949539"/>
+      <w:bookmarkStart w:id="170" w:name="_Toc14345933"/>
+      <w:bookmarkStart w:id="171" w:name="_Toc507747266"/>
       <w:r>
         <w:t>8.2.2 Ambiente</w:t>
       </w:r>
@@ -20572,11 +20581,11 @@
         </w:rPr>
         <w:t xml:space="preserve">   </w:t>
       </w:r>
-      <w:bookmarkStart w:id="172" w:name="_Toc78782582"/>
-      <w:bookmarkStart w:id="173" w:name="_Toc172810392"/>
-      <w:bookmarkStart w:id="174" w:name="_Toc507751105"/>
-      <w:bookmarkStart w:id="175" w:name="_Toc14343276"/>
-      <w:bookmarkStart w:id="176" w:name="_Toc204949482"/>
+      <w:bookmarkStart w:id="172" w:name="_Toc507751105"/>
+      <w:bookmarkStart w:id="173" w:name="_Toc78782582"/>
+      <w:bookmarkStart w:id="174" w:name="_Toc204949482"/>
+      <w:bookmarkStart w:id="175" w:name="_Toc172810392"/>
+      <w:bookmarkStart w:id="176" w:name="_Toc14343276"/>
       <w:r>
         <w:t xml:space="preserve">QUADRO </w:t>
       </w:r>
@@ -20647,6 +20656,12 @@
             <w:insideH w:val="single" w:color="auto" w:sz="4" w:space="0"/>
             <w:insideV w:val="single" w:color="auto" w:sz="4" w:space="0"/>
           </w:tblBorders>
+          <w:tblCellMar>
+            <w:top w:w="0" w:type="dxa"/>
+            <w:left w:w="108" w:type="dxa"/>
+            <w:bottom w:w="0" w:type="dxa"/>
+            <w:right w:w="108" w:type="dxa"/>
+          </w:tblCellMar>
         </w:tblPrEx>
         <w:trPr>
           <w:jc w:val="center"/>
@@ -20943,11 +20958,11 @@
         </w:rPr>
         <w:t xml:space="preserve">   </w:t>
       </w:r>
-      <w:bookmarkStart w:id="178" w:name="_Toc14343277"/>
-      <w:bookmarkStart w:id="179" w:name="_Toc172810393"/>
-      <w:bookmarkStart w:id="180" w:name="_Toc78782583"/>
-      <w:bookmarkStart w:id="181" w:name="_Toc507751106"/>
-      <w:bookmarkStart w:id="182" w:name="_Toc204949483"/>
+      <w:bookmarkStart w:id="178" w:name="_Toc172810393"/>
+      <w:bookmarkStart w:id="179" w:name="_Toc78782583"/>
+      <w:bookmarkStart w:id="180" w:name="_Toc507751106"/>
+      <w:bookmarkStart w:id="181" w:name="_Toc204949483"/>
+      <w:bookmarkStart w:id="182" w:name="_Toc14343277"/>
       <w:r>
         <w:t xml:space="preserve">QUADRO </w:t>
       </w:r>
@@ -20993,11 +21008,11 @@
         <w:pStyle w:val="3"/>
       </w:pPr>
       <w:bookmarkStart w:id="183" w:name="_Toc507747267"/>
-      <w:bookmarkStart w:id="184" w:name="_Toc172810458"/>
-      <w:bookmarkStart w:id="185" w:name="_Toc11777"/>
-      <w:bookmarkStart w:id="186" w:name="_Toc14345934"/>
+      <w:bookmarkStart w:id="184" w:name="_Toc14345934"/>
+      <w:bookmarkStart w:id="185" w:name="_Toc46909575"/>
+      <w:bookmarkStart w:id="186" w:name="_Toc11777"/>
       <w:bookmarkStart w:id="187" w:name="_Toc204949540"/>
-      <w:bookmarkStart w:id="188" w:name="_Toc46909575"/>
+      <w:bookmarkStart w:id="188" w:name="_Toc172810458"/>
       <w:r>
         <w:t>8.3 ESPECIFICAÇÃO DOS CASOS DE TESTES</w:t>
       </w:r>
@@ -21021,9 +21036,9 @@
           <w:color w:val="0000FF"/>
         </w:rPr>
       </w:pPr>
-      <w:bookmarkStart w:id="189" w:name="_Toc46909579"/>
-      <w:bookmarkStart w:id="190" w:name="_Toc14345938"/>
-      <w:bookmarkStart w:id="191" w:name="_Toc507747271"/>
+      <w:bookmarkStart w:id="189" w:name="_Toc14345938"/>
+      <w:bookmarkStart w:id="190" w:name="_Toc507747271"/>
+      <w:bookmarkStart w:id="191" w:name="_Toc46909579"/>
     </w:p>
     <w:p>
       <w:pPr>
@@ -21068,11 +21083,11 @@
           <w:color w:val="0000FF"/>
         </w:rPr>
       </w:pPr>
-      <w:bookmarkStart w:id="195" w:name="_Toc14345941"/>
-      <w:bookmarkStart w:id="196" w:name="_Toc507747274"/>
-      <w:bookmarkStart w:id="197" w:name="_Toc46909582"/>
-      <w:bookmarkStart w:id="198" w:name="_Toc172810460"/>
-      <w:bookmarkStart w:id="199" w:name="_Toc204949542"/>
+      <w:bookmarkStart w:id="195" w:name="_Toc46909582"/>
+      <w:bookmarkStart w:id="196" w:name="_Toc172810460"/>
+      <w:bookmarkStart w:id="197" w:name="_Toc204949542"/>
+      <w:bookmarkStart w:id="198" w:name="_Toc507747274"/>
+      <w:bookmarkStart w:id="199" w:name="_Toc14345941"/>
       <w:r>
         <w:rPr>
           <w:color w:val="0000FF"/>
@@ -21132,11 +21147,11 @@
         </w:rPr>
       </w:pPr>
       <w:bookmarkStart w:id="201" w:name="_Toc46909583"/>
-      <w:bookmarkStart w:id="202" w:name="_Toc204949543"/>
-      <w:bookmarkStart w:id="203" w:name="_Toc28810"/>
-      <w:bookmarkStart w:id="204" w:name="_Toc172810461"/>
-      <w:bookmarkStart w:id="205" w:name="_Toc507747275"/>
-      <w:bookmarkStart w:id="206" w:name="_Toc14345942"/>
+      <w:bookmarkStart w:id="202" w:name="_Toc28810"/>
+      <w:bookmarkStart w:id="203" w:name="_Toc172810461"/>
+      <w:bookmarkStart w:id="204" w:name="_Toc204949543"/>
+      <w:bookmarkStart w:id="205" w:name="_Toc14345942"/>
+      <w:bookmarkStart w:id="206" w:name="_Toc507747275"/>
       <w:r>
         <w:rPr>
           <w:rFonts w:eastAsia="Arial Unicode MS"/>
@@ -21185,9 +21200,9 @@
       <w:bookmarkStart w:id="207" w:name="_Toc14345943"/>
       <w:bookmarkStart w:id="208" w:name="_Toc204949544"/>
       <w:bookmarkStart w:id="209" w:name="_Toc172810462"/>
-      <w:bookmarkStart w:id="210" w:name="_Toc46909584"/>
-      <w:bookmarkStart w:id="211" w:name="_Toc507747276"/>
-      <w:bookmarkStart w:id="212" w:name="_Toc12632"/>
+      <w:bookmarkStart w:id="210" w:name="_Toc507747276"/>
+      <w:bookmarkStart w:id="211" w:name="_Toc12632"/>
+      <w:bookmarkStart w:id="212" w:name="_Toc46909584"/>
       <w:r>
         <w:t>9.1.1 Descrição da Metodologia</w:t>
       </w:r>
@@ -21224,10 +21239,10 @@
       </w:pPr>
       <w:bookmarkStart w:id="213" w:name="_Toc13586"/>
       <w:bookmarkStart w:id="214" w:name="_Toc172810463"/>
-      <w:bookmarkStart w:id="215" w:name="_Toc507747277"/>
-      <w:bookmarkStart w:id="216" w:name="_Toc204949545"/>
-      <w:bookmarkStart w:id="217" w:name="_Toc14345944"/>
-      <w:bookmarkStart w:id="218" w:name="_Toc46909585"/>
+      <w:bookmarkStart w:id="215" w:name="_Toc204949545"/>
+      <w:bookmarkStart w:id="216" w:name="_Toc14345944"/>
+      <w:bookmarkStart w:id="217" w:name="_Toc46909585"/>
+      <w:bookmarkStart w:id="218" w:name="_Toc507747277"/>
       <w:r>
         <w:t>9.1.2 Matriz de Responsabilidade</w:t>
       </w:r>
@@ -22373,11 +22388,11 @@
           <w:color w:val="0000FF"/>
         </w:rPr>
       </w:pPr>
-      <w:bookmarkStart w:id="219" w:name="_Toc172810394"/>
-      <w:bookmarkStart w:id="220" w:name="_Toc204949484"/>
-      <w:bookmarkStart w:id="221" w:name="_Toc507751111"/>
-      <w:bookmarkStart w:id="222" w:name="_Toc78782587"/>
-      <w:bookmarkStart w:id="223" w:name="_Toc14343281"/>
+      <w:bookmarkStart w:id="219" w:name="_Toc14343281"/>
+      <w:bookmarkStart w:id="220" w:name="_Toc172810394"/>
+      <w:bookmarkStart w:id="221" w:name="_Toc204949484"/>
+      <w:bookmarkStart w:id="222" w:name="_Toc507751111"/>
+      <w:bookmarkStart w:id="223" w:name="_Toc78782587"/>
       <w:r>
         <w:rPr>
           <w:color w:val="0000FF"/>
@@ -22440,8 +22455,8 @@
           <w:color w:val="0000FF"/>
         </w:rPr>
       </w:pPr>
-      <w:bookmarkStart w:id="224" w:name="_Toc46909586"/>
-      <w:bookmarkStart w:id="225" w:name="_Toc507747278"/>
+      <w:bookmarkStart w:id="224" w:name="_Toc507747278"/>
+      <w:bookmarkStart w:id="225" w:name="_Toc46909586"/>
       <w:bookmarkStart w:id="226" w:name="_Toc13797"/>
       <w:bookmarkStart w:id="227" w:name="_Toc172810464"/>
       <w:bookmarkStart w:id="228" w:name="_Toc14345945"/>
@@ -22658,10 +22673,10 @@
         </w:rPr>
       </w:pPr>
       <w:bookmarkStart w:id="230" w:name="_Toc204949485"/>
-      <w:bookmarkStart w:id="231" w:name="_Toc507751112"/>
-      <w:bookmarkStart w:id="232" w:name="_Toc78782588"/>
+      <w:bookmarkStart w:id="231" w:name="_Toc78782588"/>
+      <w:bookmarkStart w:id="232" w:name="_Toc14343282"/>
       <w:bookmarkStart w:id="233" w:name="_Toc172810395"/>
-      <w:bookmarkStart w:id="234" w:name="_Toc14343282"/>
+      <w:bookmarkStart w:id="234" w:name="_Toc507751112"/>
       <w:r>
         <w:rPr>
           <w:color w:val="0000FF"/>
@@ -22725,11 +22740,11 @@
           <w:color w:val="0000FF"/>
         </w:rPr>
       </w:pPr>
-      <w:bookmarkStart w:id="235" w:name="_Toc172810465"/>
-      <w:bookmarkStart w:id="236" w:name="_Toc13337"/>
-      <w:bookmarkStart w:id="237" w:name="_Toc14345946"/>
-      <w:bookmarkStart w:id="238" w:name="_Toc46909587"/>
-      <w:bookmarkStart w:id="239" w:name="_Toc204949547"/>
+      <w:bookmarkStart w:id="235" w:name="_Toc204949547"/>
+      <w:bookmarkStart w:id="236" w:name="_Toc172810465"/>
+      <w:bookmarkStart w:id="237" w:name="_Toc46909587"/>
+      <w:bookmarkStart w:id="238" w:name="_Toc13337"/>
+      <w:bookmarkStart w:id="239" w:name="_Toc14345946"/>
       <w:bookmarkStart w:id="240" w:name="_Toc507747279"/>
       <w:r>
         <w:rPr>
@@ -23003,11 +23018,11 @@
           <w:color w:val="0000FF"/>
         </w:rPr>
       </w:pPr>
-      <w:bookmarkStart w:id="241" w:name="_Toc78782589"/>
-      <w:bookmarkStart w:id="242" w:name="_Toc204949486"/>
-      <w:bookmarkStart w:id="243" w:name="_Toc172810396"/>
-      <w:bookmarkStart w:id="244" w:name="_Toc14343283"/>
-      <w:bookmarkStart w:id="245" w:name="_Toc507751113"/>
+      <w:bookmarkStart w:id="241" w:name="_Toc172810396"/>
+      <w:bookmarkStart w:id="242" w:name="_Toc78782589"/>
+      <w:bookmarkStart w:id="243" w:name="_Toc204949486"/>
+      <w:bookmarkStart w:id="244" w:name="_Toc507751113"/>
+      <w:bookmarkStart w:id="245" w:name="_Toc14343283"/>
       <w:r>
         <w:rPr>
           <w:color w:val="0000FF"/>
@@ -23422,10 +23437,10 @@
           <w:color w:val="0000FF"/>
         </w:rPr>
       </w:pPr>
-      <w:bookmarkStart w:id="252" w:name="_Toc507751114"/>
+      <w:bookmarkStart w:id="252" w:name="_Toc14343284"/>
       <w:bookmarkStart w:id="253" w:name="_Toc204949487"/>
-      <w:bookmarkStart w:id="254" w:name="_Toc14343284"/>
-      <w:bookmarkStart w:id="255" w:name="_Toc78782590"/>
+      <w:bookmarkStart w:id="254" w:name="_Toc78782590"/>
+      <w:bookmarkStart w:id="255" w:name="_Toc507751114"/>
       <w:bookmarkStart w:id="256" w:name="_Toc172810397"/>
       <w:r>
         <w:rPr>
@@ -23491,11 +23506,11 @@
         </w:rPr>
       </w:pPr>
       <w:bookmarkStart w:id="257" w:name="_Toc46909589"/>
-      <w:bookmarkStart w:id="258" w:name="_Toc25573"/>
-      <w:bookmarkStart w:id="259" w:name="_Toc172810467"/>
+      <w:bookmarkStart w:id="258" w:name="_Toc172810467"/>
+      <w:bookmarkStart w:id="259" w:name="_Toc204949549"/>
       <w:bookmarkStart w:id="260" w:name="_Toc14345948"/>
       <w:bookmarkStart w:id="261" w:name="_Toc507747281"/>
-      <w:bookmarkStart w:id="262" w:name="_Toc204949549"/>
+      <w:bookmarkStart w:id="262" w:name="_Toc25573"/>
       <w:r>
         <w:rPr>
           <w:color w:val="0000FF"/>
@@ -24372,8 +24387,8 @@
       <w:pPr>
         <w:pStyle w:val="2"/>
       </w:pPr>
-      <w:bookmarkStart w:id="277" w:name="_Toc204949560"/>
-      <w:bookmarkStart w:id="278" w:name="_Toc2688"/>
+      <w:bookmarkStart w:id="277" w:name="_Toc2688"/>
+      <w:bookmarkStart w:id="278" w:name="_Toc204949560"/>
       <w:r>
         <w:t>APÊNDICE H – MODELO DE NEGÓCIO</w:t>
       </w:r>
@@ -24394,8 +24409,8 @@
       <w:pPr>
         <w:pStyle w:val="2"/>
       </w:pPr>
-      <w:bookmarkStart w:id="279" w:name="_Toc13207"/>
-      <w:bookmarkStart w:id="280" w:name="_Toc204949561"/>
+      <w:bookmarkStart w:id="279" w:name="_Toc204949561"/>
+      <w:bookmarkStart w:id="280" w:name="_Toc13207"/>
       <w:bookmarkStart w:id="281" w:name="_Toc172810480"/>
       <w:r>
         <w:rPr>
@@ -24430,8 +24445,8 @@
       <w:pPr>
         <w:pStyle w:val="2"/>
       </w:pPr>
-      <w:bookmarkStart w:id="282" w:name="_Toc23905"/>
-      <w:bookmarkStart w:id="283" w:name="_Toc204949562"/>
+      <w:bookmarkStart w:id="282" w:name="_Toc204949562"/>
+      <w:bookmarkStart w:id="283" w:name="_Toc23905"/>
       <w:r>
         <w:t>APÊNDICE J – CASOS DE TESTES</w:t>
       </w:r>
@@ -24454,8 +24469,8 @@
         <w:pStyle w:val="2"/>
       </w:pPr>
       <w:bookmarkStart w:id="284" w:name="_Toc172810481"/>
-      <w:bookmarkStart w:id="285" w:name="_Toc4481"/>
-      <w:bookmarkStart w:id="286" w:name="_Toc204949563"/>
+      <w:bookmarkStart w:id="285" w:name="_Toc204949563"/>
+      <w:bookmarkStart w:id="286" w:name="_Toc4481"/>
       <w:r>
         <w:t>APÊNDICE K – RECURSOS DE APOIO À IMPLANTAÇÃO</w:t>
       </w:r>

</xml_diff>

<commit_message>
docs: update SSEService description and clarify Health endpoint response details
</commit_message>
<xml_diff>
--- a/docs/SAGE_PFC_v1.18.docx
+++ b/docs/SAGE_PFC_v1.18.docx
@@ -668,6 +668,12 @@
             <w:insideH w:val="single" w:color="000000" w:sz="6" w:space="0"/>
             <w:insideV w:val="single" w:color="000000" w:sz="6" w:space="0"/>
           </w:tblBorders>
+          <w:tblCellMar>
+            <w:top w:w="0" w:type="dxa"/>
+            <w:left w:w="10" w:type="dxa"/>
+            <w:bottom w:w="0" w:type="dxa"/>
+            <w:right w:w="10" w:type="dxa"/>
+          </w:tblCellMar>
         </w:tblPrEx>
         <w:tc>
           <w:tcPr>
@@ -3483,8 +3489,6 @@
       <w:r>
         <w:fldChar w:fldCharType="end"/>
       </w:r>
-      <w:bookmarkStart w:id="287" w:name="_GoBack"/>
-      <w:bookmarkEnd w:id="287"/>
     </w:p>
     <w:p>
       <w:pPr>
@@ -15282,9 +15286,6 @@
           <w:tab w:val="clear" w:pos="1260"/>
         </w:tabs>
         <w:ind w:left="1265" w:hanging="425"/>
-        <w:rPr>
-          <w:highlight w:val="yellow"/>
-        </w:rPr>
       </w:pPr>
       <w:r>
         <w:t xml:space="preserve">SSEService: </w:t>
@@ -15296,7 +15297,30 @@
         <w:t>Server-Sent Events (SSE), uma tecnologia web para comunicação em tempo real entre servidor</w:t>
       </w:r>
       <w:r>
-        <w:t xml:space="preserve">. </w:t>
+        <w:t>.</w:t>
+      </w:r>
+      <w:r>
+        <w:rPr>
+          <w:rFonts w:hint="default"/>
+          <w:lang w:val="pt-BR"/>
+        </w:rPr>
+        <w:t xml:space="preserve"> Foi criado uma </w:t>
+      </w:r>
+      <w:r>
+        <w:rPr>
+          <w:rFonts w:hint="default"/>
+          <w:i/>
+          <w:iCs/>
+          <w:lang w:val="pt-BR"/>
+        </w:rPr>
+        <w:t xml:space="preserve">trigger </w:t>
+      </w:r>
+      <w:r>
+        <w:rPr>
+          <w:rFonts w:hint="default"/>
+          <w:lang w:val="pt-BR"/>
+        </w:rPr>
+        <w:t>no banco de dados para notificar as alterações na tabela de assistências. O backend devolve os eventos para quem solicitou receber esses eventos.</w:t>
       </w:r>
     </w:p>
     <w:p>
@@ -15442,6 +15466,8 @@
       <w:r>
         <w:t>Controller: responsável por lidar com as requisições HTTPs e orquestrar as chamadas para os serviços.</w:t>
       </w:r>
+      <w:bookmarkStart w:id="287" w:name="_GoBack"/>
+      <w:bookmarkEnd w:id="287"/>
     </w:p>
     <w:p>
       <w:pPr>
@@ -15453,27 +15479,16 @@
           <w:tab w:val="clear" w:pos="1260"/>
         </w:tabs>
         <w:ind w:left="1265" w:hanging="425"/>
-        <w:rPr>
-          <w:highlight w:val="yellow"/>
-        </w:rPr>
-      </w:pPr>
-      <w:r>
-        <w:t xml:space="preserve">Health: controlador para </w:t>
-      </w:r>
-      <w:r>
-        <w:rPr>
-          <w:i/>
-        </w:rPr>
-        <w:t>endpoints</w:t>
-      </w:r>
-      <w:r>
-        <w:t xml:space="preserve"> relacionados </w:t>
-      </w:r>
-      <w:r>
-        <w:rPr>
-          <w:highlight w:val="yellow"/>
-        </w:rPr>
-        <w:t>à saúde e status do sistema. / Escrever melhor */</w:t>
+      </w:pPr>
+      <w:r>
+        <w:t>Health: controlador para endpoints relacionados à saúde e status do sistema</w:t>
+      </w:r>
+      <w:r>
+        <w:rPr>
+          <w:rFonts w:hint="default"/>
+          <w:lang w:val="pt-BR"/>
+        </w:rPr>
+        <w:t>. Esse endpoint por sua vez retorna dados como, status, o tempo que está ativo, a versão que está implementada e a data atual no sistema.</w:t>
       </w:r>
     </w:p>
     <w:p>
@@ -16764,8 +16779,8 @@
       <w:pPr>
         <w:pStyle w:val="4"/>
       </w:pPr>
-      <w:bookmarkStart w:id="79" w:name="_Toc26005"/>
-      <w:bookmarkStart w:id="80" w:name="_Toc204949523"/>
+      <w:bookmarkStart w:id="79" w:name="_Toc204949523"/>
+      <w:bookmarkStart w:id="80" w:name="_Toc26005"/>
       <w:r>
         <w:t>6.4.2 Projeto da Interface de Usuário</w:t>
       </w:r>
@@ -16781,10 +16796,10 @@
       <w:pPr>
         <w:pStyle w:val="4"/>
       </w:pPr>
-      <w:bookmarkStart w:id="81" w:name="_Toc172810440"/>
-      <w:bookmarkStart w:id="82" w:name="_Toc46909558"/>
+      <w:bookmarkStart w:id="81" w:name="_Toc46909558"/>
+      <w:bookmarkStart w:id="82" w:name="_Toc204949524"/>
       <w:bookmarkStart w:id="83" w:name="_Toc26364"/>
-      <w:bookmarkStart w:id="84" w:name="_Toc204949524"/>
+      <w:bookmarkStart w:id="84" w:name="_Toc172810440"/>
       <w:r>
         <w:drawing>
           <wp:inline distT="0" distB="0" distL="114300" distR="114300">
@@ -17582,8 +17597,8 @@
       <w:pPr>
         <w:pStyle w:val="4"/>
       </w:pPr>
-      <w:bookmarkStart w:id="85" w:name="_Toc30104"/>
-      <w:bookmarkStart w:id="86" w:name="_Toc172810441"/>
+      <w:bookmarkStart w:id="85" w:name="_Toc172810441"/>
+      <w:bookmarkStart w:id="86" w:name="_Toc30104"/>
       <w:bookmarkStart w:id="87" w:name="_Toc204949525"/>
       <w:r>
         <w:t>6.4.4 Projeto da Acessibilidade</w:t>
@@ -17728,12 +17743,12 @@
       <w:pPr>
         <w:pStyle w:val="3"/>
       </w:pPr>
-      <w:bookmarkStart w:id="88" w:name="_Toc507747255"/>
-      <w:bookmarkStart w:id="89" w:name="_Toc204949526"/>
-      <w:bookmarkStart w:id="90" w:name="_Toc14345922"/>
+      <w:bookmarkStart w:id="88" w:name="_Toc14345922"/>
+      <w:bookmarkStart w:id="89" w:name="_Toc28863"/>
+      <w:bookmarkStart w:id="90" w:name="_Toc507747255"/>
       <w:bookmarkStart w:id="91" w:name="_Toc172810442"/>
       <w:bookmarkStart w:id="92" w:name="_Toc46909559"/>
-      <w:bookmarkStart w:id="93" w:name="_Toc28863"/>
+      <w:bookmarkStart w:id="93" w:name="_Toc204949526"/>
       <w:r>
         <w:t>6.5 PROJETO DO SISTEMA DISTRIBUÍDO</w:t>
       </w:r>
@@ -17767,8 +17782,8 @@
         </w:rPr>
       </w:pPr>
       <w:bookmarkStart w:id="94" w:name="_Toc46909562"/>
-      <w:bookmarkStart w:id="95" w:name="_Toc172810445"/>
-      <w:bookmarkStart w:id="96" w:name="_Toc204949527"/>
+      <w:bookmarkStart w:id="95" w:name="_Toc204949527"/>
+      <w:bookmarkStart w:id="96" w:name="_Toc172810445"/>
       <w:bookmarkStart w:id="97" w:name="_Toc14345916"/>
       <w:r>
         <w:br w:type="page"/>
@@ -17848,9 +17863,9 @@
         <w:pStyle w:val="3"/>
       </w:pPr>
       <w:bookmarkStart w:id="100" w:name="_Toc172810446"/>
-      <w:bookmarkStart w:id="101" w:name="_Toc46909563"/>
-      <w:bookmarkStart w:id="102" w:name="_Toc20219"/>
-      <w:bookmarkStart w:id="103" w:name="_Toc204949528"/>
+      <w:bookmarkStart w:id="101" w:name="_Toc20219"/>
+      <w:bookmarkStart w:id="102" w:name="_Toc204949528"/>
+      <w:bookmarkStart w:id="103" w:name="_Toc46909563"/>
       <w:bookmarkStart w:id="104" w:name="_Toc14345918"/>
       <w:r>
         <w:t>7.1 COMPONENTES DO SISTEMA DE SOFTWARE</w:t>
@@ -18077,9 +18092,9 @@
       <w:pPr>
         <w:pStyle w:val="4"/>
       </w:pPr>
-      <w:bookmarkStart w:id="109" w:name="_Toc172810448"/>
-      <w:bookmarkStart w:id="110" w:name="_Toc204949530"/>
-      <w:bookmarkStart w:id="111" w:name="_Toc24234"/>
+      <w:bookmarkStart w:id="109" w:name="_Toc24234"/>
+      <w:bookmarkStart w:id="110" w:name="_Toc172810448"/>
+      <w:bookmarkStart w:id="111" w:name="_Toc204949530"/>
       <w:bookmarkStart w:id="112" w:name="_Toc46909565"/>
       <w:r>
         <w:t xml:space="preserve">7.2.1 Linguagens de Programação e </w:t>
@@ -18430,11 +18445,11 @@
         <w:pStyle w:val="4"/>
       </w:pPr>
       <w:bookmarkStart w:id="113" w:name="_Toc507747252"/>
-      <w:bookmarkStart w:id="114" w:name="_Toc20794"/>
-      <w:bookmarkStart w:id="115" w:name="_Toc204949531"/>
-      <w:bookmarkStart w:id="116" w:name="_Toc14345919"/>
-      <w:bookmarkStart w:id="117" w:name="_Toc172810449"/>
-      <w:bookmarkStart w:id="118" w:name="_Toc46909566"/>
+      <w:bookmarkStart w:id="114" w:name="_Toc46909566"/>
+      <w:bookmarkStart w:id="115" w:name="_Toc20794"/>
+      <w:bookmarkStart w:id="116" w:name="_Toc204949531"/>
+      <w:bookmarkStart w:id="117" w:name="_Toc14345919"/>
+      <w:bookmarkStart w:id="118" w:name="_Toc172810449"/>
       <w:r>
         <w:t xml:space="preserve">7.2.2 </w:t>
       </w:r>
@@ -18628,12 +18643,23 @@
       </w:r>
       <w:r>
         <w:rPr>
-          <w:highlight w:val="yellow"/>
-        </w:rPr>
-        <w:t>xxx</w:t>
-      </w:r>
-      <w:r>
-        <w:t>) recebe uma requisição HTTP com o UUID do residente.</w:t>
+          <w:rFonts w:hint="default"/>
+          <w:lang w:val="pt-BR"/>
+        </w:rPr>
+        <w:t>ResidentController</w:t>
+      </w:r>
+      <w:r>
+        <w:t>) recebe uma requisição HTTP</w:t>
+      </w:r>
+      <w:r>
+        <w:rPr>
+          <w:rFonts w:hint="default"/>
+          <w:lang w:val="pt-BR"/>
+        </w:rPr>
+        <w:t xml:space="preserve"> com o método GET </w:t>
+      </w:r>
+      <w:r>
+        <w:t>com o UUID do residente.</w:t>
       </w:r>
     </w:p>
     <w:p>
@@ -18653,7 +18679,17 @@
         <w:t>service</w:t>
       </w:r>
       <w:r>
-        <w:t xml:space="preserve"> (ResidentServiceImpl) executa a regra de negócio, buscando os dados no model (ResidentDao, Resident).</w:t>
+        <w:t xml:space="preserve"> (ResidentServiceImpl) executa a regra de negóci</w:t>
+      </w:r>
+      <w:r>
+        <w:rPr>
+          <w:rFonts w:hint="default"/>
+          <w:lang w:val="pt-BR"/>
+        </w:rPr>
+        <w:t>o</w:t>
+      </w:r>
+      <w:r>
+        <w:t>.</w:t>
       </w:r>
     </w:p>
     <w:p>
@@ -18664,25 +18700,48 @@
         </w:numPr>
       </w:pPr>
       <w:r>
-        <w:t xml:space="preserve">o resultado é devolvido para uma </w:t>
-      </w:r>
-      <w:r>
-        <w:rPr>
+        <w:rPr>
+          <w:rFonts w:hint="default"/>
+          <w:lang w:val="pt-BR"/>
+        </w:rPr>
+        <w:t xml:space="preserve">um </w:t>
+      </w:r>
+      <w:r>
+        <w:rPr>
+          <w:rFonts w:hint="default"/>
           <w:i/>
-        </w:rPr>
-        <w:t>view</w:t>
-      </w:r>
-      <w:r>
-        <w:t xml:space="preserve"> (</w:t>
-      </w:r>
-      <w:r>
-        <w:rPr>
-          <w:highlight w:val="yellow"/>
-        </w:rPr>
-        <w:t>xxx</w:t>
-      </w:r>
-      <w:r>
-        <w:t xml:space="preserve">), estruturada em um DTO (ResidentDetailResponseDto) e enviado ao cliente. </w:t>
+          <w:iCs/>
+          <w:lang w:val="pt-BR"/>
+        </w:rPr>
+        <w:t xml:space="preserve">DAO </w:t>
+      </w:r>
+      <w:r>
+        <w:rPr>
+          <w:rFonts w:hint="default"/>
+          <w:i w:val="0"/>
+          <w:iCs w:val="0"/>
+          <w:lang w:val="pt-BR"/>
+        </w:rPr>
+        <w:t>(ResidentDao)</w:t>
+      </w:r>
+      <w:r>
+        <w:rPr>
+          <w:i/>
+          <w:iCs/>
+        </w:rPr>
+        <w:t xml:space="preserve"> </w:t>
+      </w:r>
+      <w:r>
+        <w:rPr>
+          <w:rFonts w:hint="default"/>
+          <w:i w:val="0"/>
+          <w:iCs w:val="0"/>
+          <w:lang w:val="pt-BR"/>
+        </w:rPr>
+        <w:t xml:space="preserve">busca os dados no banco de dados, esses dados por sua vez é em seguida </w:t>
+      </w:r>
+      <w:r>
+        <w:t xml:space="preserve">estruturada em um DTO (ResidentDetailResponseDto) e enviado ao cliente. </w:t>
       </w:r>
     </w:p>
     <w:p>
@@ -18697,11 +18756,11 @@
       <w:pPr>
         <w:pStyle w:val="4"/>
       </w:pPr>
-      <w:bookmarkStart w:id="120" w:name="_Toc204949532"/>
-      <w:bookmarkStart w:id="121" w:name="_Toc14345920"/>
-      <w:bookmarkStart w:id="122" w:name="_Toc46909567"/>
-      <w:bookmarkStart w:id="123" w:name="_Toc25265"/>
-      <w:bookmarkStart w:id="124" w:name="_Toc172810450"/>
+      <w:bookmarkStart w:id="120" w:name="_Toc14345920"/>
+      <w:bookmarkStart w:id="121" w:name="_Toc172810450"/>
+      <w:bookmarkStart w:id="122" w:name="_Toc25265"/>
+      <w:bookmarkStart w:id="123" w:name="_Toc204949532"/>
+      <w:bookmarkStart w:id="124" w:name="_Toc46909567"/>
       <w:r>
         <w:t>7.2.3 Convenções e Guias para Codificação</w:t>
       </w:r>
@@ -19088,12 +19147,12 @@
       <w:pPr>
         <w:pStyle w:val="4"/>
       </w:pPr>
-      <w:bookmarkStart w:id="125" w:name="_Toc204949533"/>
-      <w:bookmarkStart w:id="126" w:name="_Toc24842"/>
-      <w:bookmarkStart w:id="127" w:name="_Toc46909568"/>
-      <w:bookmarkStart w:id="128" w:name="_Toc172810451"/>
-      <w:bookmarkStart w:id="129" w:name="_Toc507747250"/>
-      <w:bookmarkStart w:id="130" w:name="_Toc14345915"/>
+      <w:bookmarkStart w:id="125" w:name="_Toc24842"/>
+      <w:bookmarkStart w:id="126" w:name="_Toc507747250"/>
+      <w:bookmarkStart w:id="127" w:name="_Toc204949533"/>
+      <w:bookmarkStart w:id="128" w:name="_Toc14345915"/>
+      <w:bookmarkStart w:id="129" w:name="_Toc172810451"/>
+      <w:bookmarkStart w:id="130" w:name="_Toc46909568"/>
       <w:r>
         <w:t>7.2.4 Estrutura Física do Banco de Dados</w:t>
       </w:r>
@@ -19344,12 +19403,12 @@
       <w:pPr>
         <w:pStyle w:val="2"/>
       </w:pPr>
-      <w:bookmarkStart w:id="136" w:name="_Toc507747262"/>
-      <w:bookmarkStart w:id="137" w:name="_Toc46909570"/>
-      <w:bookmarkStart w:id="138" w:name="_Toc25807"/>
+      <w:bookmarkStart w:id="136" w:name="_Toc25807"/>
+      <w:bookmarkStart w:id="137" w:name="_Toc14345929"/>
+      <w:bookmarkStart w:id="138" w:name="_Toc46909570"/>
       <w:bookmarkStart w:id="139" w:name="_Toc172810453"/>
-      <w:bookmarkStart w:id="140" w:name="_Toc14345929"/>
-      <w:bookmarkStart w:id="141" w:name="_Toc204949535"/>
+      <w:bookmarkStart w:id="140" w:name="_Toc204949535"/>
+      <w:bookmarkStart w:id="141" w:name="_Toc507747262"/>
       <w:r>
         <w:t>8 PLANO DE TESTES</w:t>
       </w:r>
@@ -19385,12 +19444,12 @@
           <w:rFonts w:eastAsia="Arial Unicode MS"/>
         </w:rPr>
       </w:pPr>
-      <w:bookmarkStart w:id="142" w:name="_Toc14345930"/>
-      <w:bookmarkStart w:id="143" w:name="_Toc507747263"/>
-      <w:bookmarkStart w:id="144" w:name="_Toc204949536"/>
-      <w:bookmarkStart w:id="145" w:name="_Toc18606"/>
-      <w:bookmarkStart w:id="146" w:name="_Toc172810454"/>
-      <w:bookmarkStart w:id="147" w:name="_Toc46909571"/>
+      <w:bookmarkStart w:id="142" w:name="_Toc204949536"/>
+      <w:bookmarkStart w:id="143" w:name="_Toc46909571"/>
+      <w:bookmarkStart w:id="144" w:name="_Toc507747263"/>
+      <w:bookmarkStart w:id="145" w:name="_Toc14345930"/>
+      <w:bookmarkStart w:id="146" w:name="_Toc18606"/>
+      <w:bookmarkStart w:id="147" w:name="_Toc172810454"/>
       <w:r>
         <w:rPr>
           <w:rFonts w:eastAsia="Arial Unicode MS"/>
@@ -19648,8 +19707,8 @@
         </w:rPr>
       </w:pPr>
       <w:bookmarkStart w:id="148" w:name="_Toc14345931"/>
-      <w:bookmarkStart w:id="149" w:name="_Toc46909572"/>
-      <w:bookmarkStart w:id="150" w:name="_Toc172810455"/>
+      <w:bookmarkStart w:id="149" w:name="_Toc172810455"/>
+      <w:bookmarkStart w:id="150" w:name="_Toc46909572"/>
       <w:bookmarkStart w:id="151" w:name="_Toc204949537"/>
       <w:bookmarkStart w:id="152" w:name="_Toc507747264"/>
     </w:p>
@@ -19937,12 +19996,12 @@
       <w:pPr>
         <w:pStyle w:val="4"/>
       </w:pPr>
-      <w:bookmarkStart w:id="154" w:name="_Toc507747265"/>
-      <w:bookmarkStart w:id="155" w:name="_Toc14345932"/>
-      <w:bookmarkStart w:id="156" w:name="_Toc172810456"/>
-      <w:bookmarkStart w:id="157" w:name="_Toc46909573"/>
-      <w:bookmarkStart w:id="158" w:name="_Toc14606"/>
-      <w:bookmarkStart w:id="159" w:name="_Toc204949538"/>
+      <w:bookmarkStart w:id="154" w:name="_Toc46909573"/>
+      <w:bookmarkStart w:id="155" w:name="_Toc14606"/>
+      <w:bookmarkStart w:id="156" w:name="_Toc204949538"/>
+      <w:bookmarkStart w:id="157" w:name="_Toc172810456"/>
+      <w:bookmarkStart w:id="158" w:name="_Toc507747265"/>
+      <w:bookmarkStart w:id="159" w:name="_Toc14345932"/>
       <w:r>
         <w:t>8.2.1 Referências aos Documentos Relevantes</w:t>
       </w:r>
@@ -20213,11 +20272,11 @@
       </w:pPr>
       <w:bookmarkStart w:id="165" w:name="_Toc191128985"/>
       <w:bookmarkStart w:id="166" w:name="_Toc22317"/>
-      <w:bookmarkStart w:id="167" w:name="_Toc14345933"/>
+      <w:bookmarkStart w:id="167" w:name="_Toc46909574"/>
       <w:bookmarkStart w:id="168" w:name="_Toc204949539"/>
       <w:bookmarkStart w:id="169" w:name="_Toc507747266"/>
-      <w:bookmarkStart w:id="170" w:name="_Toc172810457"/>
-      <w:bookmarkStart w:id="171" w:name="_Toc46909574"/>
+      <w:bookmarkStart w:id="170" w:name="_Toc14345933"/>
+      <w:bookmarkStart w:id="171" w:name="_Toc172810457"/>
       <w:r>
         <w:t>8.2.2 Ambiente</w:t>
       </w:r>
@@ -20572,11 +20631,11 @@
         </w:rPr>
         <w:t xml:space="preserve">   </w:t>
       </w:r>
-      <w:bookmarkStart w:id="172" w:name="_Toc78782582"/>
-      <w:bookmarkStart w:id="173" w:name="_Toc172810392"/>
-      <w:bookmarkStart w:id="174" w:name="_Toc507751105"/>
-      <w:bookmarkStart w:id="175" w:name="_Toc14343276"/>
-      <w:bookmarkStart w:id="176" w:name="_Toc204949482"/>
+      <w:bookmarkStart w:id="172" w:name="_Toc14343276"/>
+      <w:bookmarkStart w:id="173" w:name="_Toc204949482"/>
+      <w:bookmarkStart w:id="174" w:name="_Toc172810392"/>
+      <w:bookmarkStart w:id="175" w:name="_Toc78782582"/>
+      <w:bookmarkStart w:id="176" w:name="_Toc507751105"/>
       <w:r>
         <w:t xml:space="preserve">QUADRO </w:t>
       </w:r>
@@ -20647,6 +20706,12 @@
             <w:insideH w:val="single" w:color="auto" w:sz="4" w:space="0"/>
             <w:insideV w:val="single" w:color="auto" w:sz="4" w:space="0"/>
           </w:tblBorders>
+          <w:tblCellMar>
+            <w:top w:w="0" w:type="dxa"/>
+            <w:left w:w="108" w:type="dxa"/>
+            <w:bottom w:w="0" w:type="dxa"/>
+            <w:right w:w="108" w:type="dxa"/>
+          </w:tblCellMar>
         </w:tblPrEx>
         <w:trPr>
           <w:jc w:val="center"/>
@@ -20943,9 +21008,9 @@
         </w:rPr>
         <w:t xml:space="preserve">   </w:t>
       </w:r>
-      <w:bookmarkStart w:id="178" w:name="_Toc14343277"/>
-      <w:bookmarkStart w:id="179" w:name="_Toc172810393"/>
-      <w:bookmarkStart w:id="180" w:name="_Toc78782583"/>
+      <w:bookmarkStart w:id="178" w:name="_Toc78782583"/>
+      <w:bookmarkStart w:id="179" w:name="_Toc14343277"/>
+      <w:bookmarkStart w:id="180" w:name="_Toc172810393"/>
       <w:bookmarkStart w:id="181" w:name="_Toc507751106"/>
       <w:bookmarkStart w:id="182" w:name="_Toc204949483"/>
       <w:r>
@@ -20992,11 +21057,11 @@
       <w:pPr>
         <w:pStyle w:val="3"/>
       </w:pPr>
-      <w:bookmarkStart w:id="183" w:name="_Toc507747267"/>
+      <w:bookmarkStart w:id="183" w:name="_Toc14345934"/>
       <w:bookmarkStart w:id="184" w:name="_Toc172810458"/>
       <w:bookmarkStart w:id="185" w:name="_Toc11777"/>
-      <w:bookmarkStart w:id="186" w:name="_Toc14345934"/>
-      <w:bookmarkStart w:id="187" w:name="_Toc204949540"/>
+      <w:bookmarkStart w:id="186" w:name="_Toc204949540"/>
+      <w:bookmarkStart w:id="187" w:name="_Toc507747267"/>
       <w:bookmarkStart w:id="188" w:name="_Toc46909575"/>
       <w:r>
         <w:t>8.3 ESPECIFICAÇÃO DOS CASOS DE TESTES</w:t>
@@ -21068,11 +21133,11 @@
           <w:color w:val="0000FF"/>
         </w:rPr>
       </w:pPr>
-      <w:bookmarkStart w:id="195" w:name="_Toc14345941"/>
+      <w:bookmarkStart w:id="195" w:name="_Toc172810460"/>
       <w:bookmarkStart w:id="196" w:name="_Toc507747274"/>
       <w:bookmarkStart w:id="197" w:name="_Toc46909582"/>
-      <w:bookmarkStart w:id="198" w:name="_Toc172810460"/>
-      <w:bookmarkStart w:id="199" w:name="_Toc204949542"/>
+      <w:bookmarkStart w:id="198" w:name="_Toc204949542"/>
+      <w:bookmarkStart w:id="199" w:name="_Toc14345941"/>
       <w:r>
         <w:rPr>
           <w:color w:val="0000FF"/>
@@ -21131,12 +21196,12 @@
           <w:color w:val="0000FF"/>
         </w:rPr>
       </w:pPr>
-      <w:bookmarkStart w:id="201" w:name="_Toc46909583"/>
-      <w:bookmarkStart w:id="202" w:name="_Toc204949543"/>
-      <w:bookmarkStart w:id="203" w:name="_Toc28810"/>
-      <w:bookmarkStart w:id="204" w:name="_Toc172810461"/>
+      <w:bookmarkStart w:id="201" w:name="_Toc14345942"/>
+      <w:bookmarkStart w:id="202" w:name="_Toc172810461"/>
+      <w:bookmarkStart w:id="203" w:name="_Toc46909583"/>
+      <w:bookmarkStart w:id="204" w:name="_Toc28810"/>
       <w:bookmarkStart w:id="205" w:name="_Toc507747275"/>
-      <w:bookmarkStart w:id="206" w:name="_Toc14345942"/>
+      <w:bookmarkStart w:id="206" w:name="_Toc204949543"/>
       <w:r>
         <w:rPr>
           <w:rFonts w:eastAsia="Arial Unicode MS"/>
@@ -21222,12 +21287,12 @@
       <w:pPr>
         <w:pStyle w:val="4"/>
       </w:pPr>
-      <w:bookmarkStart w:id="213" w:name="_Toc13586"/>
-      <w:bookmarkStart w:id="214" w:name="_Toc172810463"/>
+      <w:bookmarkStart w:id="213" w:name="_Toc172810463"/>
+      <w:bookmarkStart w:id="214" w:name="_Toc13586"/>
       <w:bookmarkStart w:id="215" w:name="_Toc507747277"/>
-      <w:bookmarkStart w:id="216" w:name="_Toc204949545"/>
-      <w:bookmarkStart w:id="217" w:name="_Toc14345944"/>
-      <w:bookmarkStart w:id="218" w:name="_Toc46909585"/>
+      <w:bookmarkStart w:id="216" w:name="_Toc14345944"/>
+      <w:bookmarkStart w:id="217" w:name="_Toc46909585"/>
+      <w:bookmarkStart w:id="218" w:name="_Toc204949545"/>
       <w:r>
         <w:t>9.1.2 Matriz de Responsabilidade</w:t>
       </w:r>
@@ -22373,9 +22438,9 @@
           <w:color w:val="0000FF"/>
         </w:rPr>
       </w:pPr>
-      <w:bookmarkStart w:id="219" w:name="_Toc172810394"/>
-      <w:bookmarkStart w:id="220" w:name="_Toc204949484"/>
-      <w:bookmarkStart w:id="221" w:name="_Toc507751111"/>
+      <w:bookmarkStart w:id="219" w:name="_Toc204949484"/>
+      <w:bookmarkStart w:id="220" w:name="_Toc507751111"/>
+      <w:bookmarkStart w:id="221" w:name="_Toc172810394"/>
       <w:bookmarkStart w:id="222" w:name="_Toc78782587"/>
       <w:bookmarkStart w:id="223" w:name="_Toc14343281"/>
       <w:r>
@@ -22440,12 +22505,12 @@
           <w:color w:val="0000FF"/>
         </w:rPr>
       </w:pPr>
-      <w:bookmarkStart w:id="224" w:name="_Toc46909586"/>
-      <w:bookmarkStart w:id="225" w:name="_Toc507747278"/>
-      <w:bookmarkStart w:id="226" w:name="_Toc13797"/>
+      <w:bookmarkStart w:id="224" w:name="_Toc13797"/>
+      <w:bookmarkStart w:id="225" w:name="_Toc204949546"/>
+      <w:bookmarkStart w:id="226" w:name="_Toc507747278"/>
       <w:bookmarkStart w:id="227" w:name="_Toc172810464"/>
-      <w:bookmarkStart w:id="228" w:name="_Toc14345945"/>
-      <w:bookmarkStart w:id="229" w:name="_Toc204949546"/>
+      <w:bookmarkStart w:id="228" w:name="_Toc46909586"/>
+      <w:bookmarkStart w:id="229" w:name="_Toc14345945"/>
       <w:r>
         <w:rPr>
           <w:color w:val="0000FF"/>
@@ -22658,10 +22723,10 @@
         </w:rPr>
       </w:pPr>
       <w:bookmarkStart w:id="230" w:name="_Toc204949485"/>
-      <w:bookmarkStart w:id="231" w:name="_Toc507751112"/>
-      <w:bookmarkStart w:id="232" w:name="_Toc78782588"/>
+      <w:bookmarkStart w:id="231" w:name="_Toc14343282"/>
+      <w:bookmarkStart w:id="232" w:name="_Toc507751112"/>
       <w:bookmarkStart w:id="233" w:name="_Toc172810395"/>
-      <w:bookmarkStart w:id="234" w:name="_Toc14343282"/>
+      <w:bookmarkStart w:id="234" w:name="_Toc78782588"/>
       <w:r>
         <w:rPr>
           <w:color w:val="0000FF"/>
@@ -22725,12 +22790,12 @@
           <w:color w:val="0000FF"/>
         </w:rPr>
       </w:pPr>
-      <w:bookmarkStart w:id="235" w:name="_Toc172810465"/>
+      <w:bookmarkStart w:id="235" w:name="_Toc204949547"/>
       <w:bookmarkStart w:id="236" w:name="_Toc13337"/>
       <w:bookmarkStart w:id="237" w:name="_Toc14345946"/>
-      <w:bookmarkStart w:id="238" w:name="_Toc46909587"/>
-      <w:bookmarkStart w:id="239" w:name="_Toc204949547"/>
-      <w:bookmarkStart w:id="240" w:name="_Toc507747279"/>
+      <w:bookmarkStart w:id="238" w:name="_Toc507747279"/>
+      <w:bookmarkStart w:id="239" w:name="_Toc172810465"/>
+      <w:bookmarkStart w:id="240" w:name="_Toc46909587"/>
       <w:r>
         <w:rPr>
           <w:color w:val="0000FF"/>
@@ -23003,11 +23068,11 @@
           <w:color w:val="0000FF"/>
         </w:rPr>
       </w:pPr>
-      <w:bookmarkStart w:id="241" w:name="_Toc78782589"/>
-      <w:bookmarkStart w:id="242" w:name="_Toc204949486"/>
-      <w:bookmarkStart w:id="243" w:name="_Toc172810396"/>
+      <w:bookmarkStart w:id="241" w:name="_Toc172810396"/>
+      <w:bookmarkStart w:id="242" w:name="_Toc507751113"/>
+      <w:bookmarkStart w:id="243" w:name="_Toc78782589"/>
       <w:bookmarkStart w:id="244" w:name="_Toc14343283"/>
-      <w:bookmarkStart w:id="245" w:name="_Toc507751113"/>
+      <w:bookmarkStart w:id="245" w:name="_Toc204949486"/>
       <w:r>
         <w:rPr>
           <w:color w:val="0000FF"/>
@@ -23071,12 +23136,12 @@
           <w:color w:val="0000FF"/>
         </w:rPr>
       </w:pPr>
-      <w:bookmarkStart w:id="246" w:name="_Toc172810466"/>
-      <w:bookmarkStart w:id="247" w:name="_Toc14345947"/>
-      <w:bookmarkStart w:id="248" w:name="_Toc204949548"/>
-      <w:bookmarkStart w:id="249" w:name="_Toc507747280"/>
-      <w:bookmarkStart w:id="250" w:name="_Toc46909588"/>
-      <w:bookmarkStart w:id="251" w:name="_Toc2408"/>
+      <w:bookmarkStart w:id="246" w:name="_Toc14345947"/>
+      <w:bookmarkStart w:id="247" w:name="_Toc507747280"/>
+      <w:bookmarkStart w:id="248" w:name="_Toc46909588"/>
+      <w:bookmarkStart w:id="249" w:name="_Toc2408"/>
+      <w:bookmarkStart w:id="250" w:name="_Toc204949548"/>
+      <w:bookmarkStart w:id="251" w:name="_Toc172810466"/>
       <w:r>
         <w:rPr>
           <w:color w:val="0000FF"/>
@@ -23422,10 +23487,10 @@
           <w:color w:val="0000FF"/>
         </w:rPr>
       </w:pPr>
-      <w:bookmarkStart w:id="252" w:name="_Toc507751114"/>
-      <w:bookmarkStart w:id="253" w:name="_Toc204949487"/>
-      <w:bookmarkStart w:id="254" w:name="_Toc14343284"/>
-      <w:bookmarkStart w:id="255" w:name="_Toc78782590"/>
+      <w:bookmarkStart w:id="252" w:name="_Toc14343284"/>
+      <w:bookmarkStart w:id="253" w:name="_Toc78782590"/>
+      <w:bookmarkStart w:id="254" w:name="_Toc204949487"/>
+      <w:bookmarkStart w:id="255" w:name="_Toc507751114"/>
       <w:bookmarkStart w:id="256" w:name="_Toc172810397"/>
       <w:r>
         <w:rPr>
@@ -23490,12 +23555,12 @@
           <w:color w:val="0000FF"/>
         </w:rPr>
       </w:pPr>
-      <w:bookmarkStart w:id="257" w:name="_Toc46909589"/>
-      <w:bookmarkStart w:id="258" w:name="_Toc25573"/>
-      <w:bookmarkStart w:id="259" w:name="_Toc172810467"/>
-      <w:bookmarkStart w:id="260" w:name="_Toc14345948"/>
-      <w:bookmarkStart w:id="261" w:name="_Toc507747281"/>
-      <w:bookmarkStart w:id="262" w:name="_Toc204949549"/>
+      <w:bookmarkStart w:id="257" w:name="_Toc25573"/>
+      <w:bookmarkStart w:id="258" w:name="_Toc172810467"/>
+      <w:bookmarkStart w:id="259" w:name="_Toc507747281"/>
+      <w:bookmarkStart w:id="260" w:name="_Toc204949549"/>
+      <w:bookmarkStart w:id="261" w:name="_Toc14345948"/>
+      <w:bookmarkStart w:id="262" w:name="_Toc46909589"/>
       <w:r>
         <w:rPr>
           <w:color w:val="0000FF"/>
@@ -24240,8 +24305,8 @@
         <w:br w:type="page"/>
       </w:r>
       <w:bookmarkStart w:id="269" w:name="_Toc10367"/>
-      <w:bookmarkStart w:id="270" w:name="_Toc284603410"/>
-      <w:bookmarkStart w:id="271" w:name="_Toc192060122"/>
+      <w:bookmarkStart w:id="270" w:name="_Toc192060122"/>
+      <w:bookmarkStart w:id="271" w:name="_Toc284603410"/>
       <w:r>
         <w:t>APÊNDICE B – RELATÓRIO DE DESEMPENHO</w:t>
       </w:r>
@@ -24453,9 +24518,9 @@
       <w:pPr>
         <w:pStyle w:val="2"/>
       </w:pPr>
-      <w:bookmarkStart w:id="284" w:name="_Toc172810481"/>
-      <w:bookmarkStart w:id="285" w:name="_Toc4481"/>
-      <w:bookmarkStart w:id="286" w:name="_Toc204949563"/>
+      <w:bookmarkStart w:id="284" w:name="_Toc204949563"/>
+      <w:bookmarkStart w:id="285" w:name="_Toc172810481"/>
+      <w:bookmarkStart w:id="286" w:name="_Toc4481"/>
       <w:r>
         <w:t>APÊNDICE K – RECURSOS DE APOIO À IMPLANTAÇÃO</w:t>
       </w:r>

</xml_diff>

<commit_message>
docs: update authors and enhance SSE and Controller sections in documentation
</commit_message>
<xml_diff>
--- a/docs/SAGE_PFC_v1.18.docx
+++ b/docs/SAGE_PFC_v1.18.docx
@@ -876,7 +876,7 @@
                 <w:rFonts w:hint="default"/>
                 <w:lang w:val="pt-BR"/>
               </w:rPr>
-              <w:t>Carlos Eduardo de Almeida Rosa</w:t>
+              <w:t>Alan Francisco Silva, Carlos Eduardo de Almeida Rosa</w:t>
             </w:r>
           </w:p>
         </w:tc>
@@ -12122,8 +12122,8 @@
       <w:r>
         <w:t>) após validação e testes.</w:t>
       </w:r>
-      <w:bookmarkStart w:id="39" w:name="_Toc192060090"/>
-      <w:bookmarkStart w:id="40" w:name="_Toc192060091"/>
+      <w:bookmarkStart w:id="39" w:name="_Toc192060091"/>
+      <w:bookmarkStart w:id="40" w:name="_Toc192060090"/>
       <w:r>
         <w:t xml:space="preserve"> A Figura 4 ilustra uma parte do repositório hospedado no Github (servidor em Nuvem).</w:t>
       </w:r>
@@ -15279,13 +15279,13 @@
     <w:p>
       <w:pPr>
         <w:numPr>
-          <w:ilvl w:val="2"/>
+          <w:ilvl w:val="1"/>
           <w:numId w:val="9"/>
         </w:numPr>
         <w:tabs>
-          <w:tab w:val="clear" w:pos="1260"/>
+          <w:tab w:val="clear" w:pos="840"/>
         </w:tabs>
-        <w:ind w:left="1265" w:hanging="425"/>
+        <w:ind w:left="845" w:hanging="425"/>
       </w:pPr>
       <w:r>
         <w:rPr>
@@ -15300,10 +15300,7 @@
         <w:rPr>
           <w:rFonts w:hint="default"/>
         </w:rPr>
-        <w:t>Server-Sent Events (SSE), uma tecnologia web para comunicação em tempo real entre servidor</w:t>
-      </w:r>
-      <w:r>
-        <w:t>.</w:t>
+        <w:t>Server-Sent Events (SSE), uma tecnologia web para comunicação em tempo real entre servidor. Foi criado uma trigger no banco de dados para notificar as alterações na tabela de assistências. O backend devolve os eventos para quem solicitou receber esses eventos.</w:t>
       </w:r>
     </w:p>
     <w:p>
@@ -15317,8 +15314,6 @@
         </w:tabs>
         <w:ind w:left="845" w:hanging="425"/>
       </w:pPr>
-      <w:bookmarkStart w:id="287" w:name="_GoBack"/>
-      <w:bookmarkEnd w:id="287"/>
       <w:r>
         <w:t xml:space="preserve">DTO: Agrupa os </w:t>
       </w:r>
@@ -15462,27 +15457,15 @@
           <w:tab w:val="clear" w:pos="1260"/>
         </w:tabs>
         <w:ind w:left="1265" w:hanging="425"/>
-        <w:rPr>
-          <w:highlight w:val="yellow"/>
-        </w:rPr>
-      </w:pPr>
-      <w:r>
-        <w:t xml:space="preserve">Health: controlador para </w:t>
-      </w:r>
-      <w:r>
-        <w:rPr>
-          <w:i/>
-        </w:rPr>
-        <w:t>endpoints</w:t>
-      </w:r>
-      <w:r>
-        <w:t xml:space="preserve"> relacionados </w:t>
-      </w:r>
-      <w:r>
-        <w:rPr>
-          <w:highlight w:val="yellow"/>
-        </w:rPr>
-        <w:t>à saúde e status do sistema. / Escrever melhor */</w:t>
+      </w:pPr>
+      <w:r>
+        <w:t xml:space="preserve">Health: </w:t>
+      </w:r>
+      <w:r>
+        <w:rPr>
+          <w:rFonts w:hint="default"/>
+        </w:rPr>
+        <w:t>controlador para endpoints relacionados à saúde e status do sistema. Esse endpoint por sua vez retorna dados como, status, o tempo que está ativo, a versão que está implementada e a data atual no sistema.</w:t>
       </w:r>
     </w:p>
     <w:p>
@@ -17591,8 +17574,8 @@
       <w:pPr>
         <w:pStyle w:val="4"/>
       </w:pPr>
-      <w:bookmarkStart w:id="85" w:name="_Toc172810441"/>
-      <w:bookmarkStart w:id="86" w:name="_Toc30104"/>
+      <w:bookmarkStart w:id="85" w:name="_Toc30104"/>
+      <w:bookmarkStart w:id="86" w:name="_Toc172810441"/>
       <w:bookmarkStart w:id="87" w:name="_Toc204949525"/>
       <w:r>
         <w:t>6.4.4 Projeto da Acessibilidade</w:t>
@@ -17737,12 +17720,12 @@
       <w:pPr>
         <w:pStyle w:val="3"/>
       </w:pPr>
-      <w:bookmarkStart w:id="88" w:name="_Toc507747255"/>
-      <w:bookmarkStart w:id="89" w:name="_Toc172810442"/>
+      <w:bookmarkStart w:id="88" w:name="_Toc204949526"/>
+      <w:bookmarkStart w:id="89" w:name="_Toc46909559"/>
       <w:bookmarkStart w:id="90" w:name="_Toc28863"/>
-      <w:bookmarkStart w:id="91" w:name="_Toc14345922"/>
-      <w:bookmarkStart w:id="92" w:name="_Toc204949526"/>
-      <w:bookmarkStart w:id="93" w:name="_Toc46909559"/>
+      <w:bookmarkStart w:id="91" w:name="_Toc507747255"/>
+      <w:bookmarkStart w:id="92" w:name="_Toc172810442"/>
+      <w:bookmarkStart w:id="93" w:name="_Toc14345922"/>
       <w:r>
         <w:t>6.5 PROJETO DO SISTEMA DISTRIBUÍDO</w:t>
       </w:r>
@@ -17775,9 +17758,9 @@
           <w:kern w:val="32"/>
         </w:rPr>
       </w:pPr>
-      <w:bookmarkStart w:id="94" w:name="_Toc172810445"/>
-      <w:bookmarkStart w:id="95" w:name="_Toc46909562"/>
-      <w:bookmarkStart w:id="96" w:name="_Toc204949527"/>
+      <w:bookmarkStart w:id="94" w:name="_Toc46909562"/>
+      <w:bookmarkStart w:id="95" w:name="_Toc204949527"/>
+      <w:bookmarkStart w:id="96" w:name="_Toc172810445"/>
       <w:bookmarkStart w:id="97" w:name="_Toc14345916"/>
       <w:r>
         <w:br w:type="page"/>
@@ -17856,10 +17839,10 @@
       <w:pPr>
         <w:pStyle w:val="3"/>
       </w:pPr>
-      <w:bookmarkStart w:id="100" w:name="_Toc172810446"/>
-      <w:bookmarkStart w:id="101" w:name="_Toc46909563"/>
-      <w:bookmarkStart w:id="102" w:name="_Toc20219"/>
-      <w:bookmarkStart w:id="103" w:name="_Toc204949528"/>
+      <w:bookmarkStart w:id="100" w:name="_Toc46909563"/>
+      <w:bookmarkStart w:id="101" w:name="_Toc20219"/>
+      <w:bookmarkStart w:id="102" w:name="_Toc204949528"/>
+      <w:bookmarkStart w:id="103" w:name="_Toc172810446"/>
       <w:bookmarkStart w:id="104" w:name="_Toc14345918"/>
       <w:r>
         <w:t>7.1 COMPONENTES DO SISTEMA DE SOFTWARE</w:t>
@@ -18086,10 +18069,10 @@
       <w:pPr>
         <w:pStyle w:val="4"/>
       </w:pPr>
-      <w:bookmarkStart w:id="109" w:name="_Toc204949530"/>
-      <w:bookmarkStart w:id="110" w:name="_Toc46909565"/>
-      <w:bookmarkStart w:id="111" w:name="_Toc172810448"/>
-      <w:bookmarkStart w:id="112" w:name="_Toc24234"/>
+      <w:bookmarkStart w:id="109" w:name="_Toc172810448"/>
+      <w:bookmarkStart w:id="110" w:name="_Toc24234"/>
+      <w:bookmarkStart w:id="111" w:name="_Toc204949530"/>
+      <w:bookmarkStart w:id="112" w:name="_Toc46909565"/>
       <w:r>
         <w:t xml:space="preserve">7.2.1 Linguagens de Programação e </w:t>
       </w:r>
@@ -18439,8 +18422,8 @@
         <w:pStyle w:val="4"/>
       </w:pPr>
       <w:bookmarkStart w:id="113" w:name="_Toc507747252"/>
-      <w:bookmarkStart w:id="114" w:name="_Toc14345919"/>
-      <w:bookmarkStart w:id="115" w:name="_Toc204949531"/>
+      <w:bookmarkStart w:id="114" w:name="_Toc204949531"/>
+      <w:bookmarkStart w:id="115" w:name="_Toc14345919"/>
       <w:bookmarkStart w:id="116" w:name="_Toc20794"/>
       <w:bookmarkStart w:id="117" w:name="_Toc172810449"/>
       <w:bookmarkStart w:id="118" w:name="_Toc46909566"/>
@@ -18622,27 +18605,37 @@
           <w:ilvl w:val="0"/>
           <w:numId w:val="17"/>
         </w:numPr>
-      </w:pPr>
-      <w:r>
+        <w:rPr>
+          <w:rFonts w:hint="default"/>
+        </w:rPr>
+      </w:pPr>
+      <w:r>
+        <w:rPr>
+          <w:rFonts w:hint="default"/>
+        </w:rPr>
         <w:t xml:space="preserve">um </w:t>
       </w:r>
       <w:r>
         <w:rPr>
+          <w:rFonts w:hint="default"/>
           <w:i/>
-        </w:rPr>
-        <w:t>controller</w:t>
-      </w:r>
-      <w:r>
-        <w:t xml:space="preserve"> (</w:t>
-      </w:r>
-      <w:r>
-        <w:rPr>
-          <w:highlight w:val="yellow"/>
-        </w:rPr>
-        <w:t>xxx</w:t>
-      </w:r>
-      <w:r>
-        <w:t>) recebe uma requisição HTTP com o UUID do residente.</w:t>
+          <w:iCs/>
+        </w:rPr>
+        <w:t xml:space="preserve">controller </w:t>
+      </w:r>
+      <w:r>
+        <w:rPr>
+          <w:rFonts w:hint="default"/>
+        </w:rPr>
+        <w:t>(ResidentController) recebe uma requisição HTTP com o método GET com o UUI</w:t>
+      </w:r>
+      <w:bookmarkStart w:id="287" w:name="_GoBack"/>
+      <w:bookmarkEnd w:id="287"/>
+      <w:r>
+        <w:rPr>
+          <w:rFonts w:hint="default"/>
+        </w:rPr>
+        <w:t>D do residente.</w:t>
       </w:r>
     </w:p>
     <w:p>
@@ -18651,18 +18644,29 @@
           <w:ilvl w:val="0"/>
           <w:numId w:val="17"/>
         </w:numPr>
-      </w:pPr>
-      <w:r>
+        <w:rPr>
+          <w:rFonts w:hint="default"/>
+        </w:rPr>
+      </w:pPr>
+      <w:r>
+        <w:rPr>
+          <w:rFonts w:hint="default"/>
+        </w:rPr>
         <w:t xml:space="preserve">um </w:t>
       </w:r>
       <w:r>
         <w:rPr>
+          <w:rFonts w:hint="default"/>
           <w:i/>
-        </w:rPr>
-        <w:t>service</w:t>
-      </w:r>
-      <w:r>
-        <w:t xml:space="preserve"> (ResidentServiceImpl) executa a regra de negócio, buscando os dados no model (ResidentDao, Resident).</w:t>
+          <w:iCs/>
+        </w:rPr>
+        <w:t xml:space="preserve">service </w:t>
+      </w:r>
+      <w:r>
+        <w:rPr>
+          <w:rFonts w:hint="default"/>
+        </w:rPr>
+        <w:t>(ResidentServiceImpl) executa a regra de negócio.</w:t>
       </w:r>
     </w:p>
     <w:p>
@@ -18671,27 +18675,29 @@
           <w:ilvl w:val="0"/>
           <w:numId w:val="17"/>
         </w:numPr>
-      </w:pPr>
-      <w:r>
-        <w:t xml:space="preserve">o resultado é devolvido para uma </w:t>
-      </w:r>
-      <w:r>
-        <w:rPr>
+        <w:rPr>
+          <w:rFonts w:hint="default"/>
+        </w:rPr>
+      </w:pPr>
+      <w:r>
+        <w:rPr>
+          <w:rFonts w:hint="default"/>
+        </w:rPr>
+        <w:t xml:space="preserve">um </w:t>
+      </w:r>
+      <w:r>
+        <w:rPr>
+          <w:rFonts w:hint="default"/>
           <w:i/>
-        </w:rPr>
-        <w:t>view</w:t>
-      </w:r>
-      <w:r>
-        <w:t xml:space="preserve"> (</w:t>
-      </w:r>
-      <w:r>
-        <w:rPr>
-          <w:highlight w:val="yellow"/>
-        </w:rPr>
-        <w:t>xxx</w:t>
-      </w:r>
-      <w:r>
-        <w:t xml:space="preserve">), estruturada em um DTO (ResidentDetailResponseDto) e enviado ao cliente. </w:t>
+          <w:iCs/>
+        </w:rPr>
+        <w:t xml:space="preserve">DAO </w:t>
+      </w:r>
+      <w:r>
+        <w:rPr>
+          <w:rFonts w:hint="default"/>
+        </w:rPr>
+        <w:t xml:space="preserve">(ResidentDao) busca os dados no banco de dados, esses dados por sua vez é em seguida estruturada em um DTO (ResidentDetailResponseDto) e enviado ao cliente.. </w:t>
       </w:r>
     </w:p>
     <w:p>
@@ -18707,10 +18713,10 @@
         <w:pStyle w:val="4"/>
       </w:pPr>
       <w:bookmarkStart w:id="120" w:name="_Toc204949532"/>
-      <w:bookmarkStart w:id="121" w:name="_Toc14345920"/>
-      <w:bookmarkStart w:id="122" w:name="_Toc46909567"/>
+      <w:bookmarkStart w:id="121" w:name="_Toc46909567"/>
+      <w:bookmarkStart w:id="122" w:name="_Toc172810450"/>
       <w:bookmarkStart w:id="123" w:name="_Toc25265"/>
-      <w:bookmarkStart w:id="124" w:name="_Toc172810450"/>
+      <w:bookmarkStart w:id="124" w:name="_Toc14345920"/>
       <w:r>
         <w:t>7.2.3 Convenções e Guias para Codificação</w:t>
       </w:r>
@@ -19097,8 +19103,8 @@
       <w:pPr>
         <w:pStyle w:val="4"/>
       </w:pPr>
-      <w:bookmarkStart w:id="125" w:name="_Toc204949533"/>
-      <w:bookmarkStart w:id="126" w:name="_Toc24842"/>
+      <w:bookmarkStart w:id="125" w:name="_Toc24842"/>
+      <w:bookmarkStart w:id="126" w:name="_Toc204949533"/>
       <w:bookmarkStart w:id="127" w:name="_Toc46909568"/>
       <w:bookmarkStart w:id="128" w:name="_Toc172810451"/>
       <w:bookmarkStart w:id="129" w:name="_Toc507747250"/>
@@ -19136,10 +19142,10 @@
         </w:rPr>
       </w:pPr>
       <w:bookmarkStart w:id="131" w:name="_Toc204949534"/>
-      <w:bookmarkStart w:id="132" w:name="_Toc17202"/>
-      <w:bookmarkStart w:id="133" w:name="_Toc46909569"/>
-      <w:bookmarkStart w:id="134" w:name="_Toc172810452"/>
-      <w:bookmarkStart w:id="135" w:name="_Toc14345921"/>
+      <w:bookmarkStart w:id="132" w:name="_Toc46909569"/>
+      <w:bookmarkStart w:id="133" w:name="_Toc14345921"/>
+      <w:bookmarkStart w:id="134" w:name="_Toc17202"/>
+      <w:bookmarkStart w:id="135" w:name="_Toc172810452"/>
       <w:r>
         <w:t>7.3 ANÁLISE DE COMPLEXIDADE ALGORÍTMICA</w:t>
       </w:r>
@@ -19353,12 +19359,12 @@
       <w:pPr>
         <w:pStyle w:val="2"/>
       </w:pPr>
-      <w:bookmarkStart w:id="136" w:name="_Toc14345929"/>
-      <w:bookmarkStart w:id="137" w:name="_Toc204949535"/>
-      <w:bookmarkStart w:id="138" w:name="_Toc507747262"/>
-      <w:bookmarkStart w:id="139" w:name="_Toc172810453"/>
-      <w:bookmarkStart w:id="140" w:name="_Toc25807"/>
-      <w:bookmarkStart w:id="141" w:name="_Toc46909570"/>
+      <w:bookmarkStart w:id="136" w:name="_Toc46909570"/>
+      <w:bookmarkStart w:id="137" w:name="_Toc507747262"/>
+      <w:bookmarkStart w:id="138" w:name="_Toc172810453"/>
+      <w:bookmarkStart w:id="139" w:name="_Toc25807"/>
+      <w:bookmarkStart w:id="140" w:name="_Toc14345929"/>
+      <w:bookmarkStart w:id="141" w:name="_Toc204949535"/>
       <w:r>
         <w:t>8 PLANO DE TESTES</w:t>
       </w:r>
@@ -19394,12 +19400,12 @@
           <w:rFonts w:eastAsia="Arial Unicode MS"/>
         </w:rPr>
       </w:pPr>
-      <w:bookmarkStart w:id="142" w:name="_Toc14345930"/>
-      <w:bookmarkStart w:id="143" w:name="_Toc507747263"/>
-      <w:bookmarkStart w:id="144" w:name="_Toc204949536"/>
-      <w:bookmarkStart w:id="145" w:name="_Toc18606"/>
-      <w:bookmarkStart w:id="146" w:name="_Toc172810454"/>
-      <w:bookmarkStart w:id="147" w:name="_Toc46909571"/>
+      <w:bookmarkStart w:id="142" w:name="_Toc172810454"/>
+      <w:bookmarkStart w:id="143" w:name="_Toc46909571"/>
+      <w:bookmarkStart w:id="144" w:name="_Toc507747263"/>
+      <w:bookmarkStart w:id="145" w:name="_Toc204949536"/>
+      <w:bookmarkStart w:id="146" w:name="_Toc18606"/>
+      <w:bookmarkStart w:id="147" w:name="_Toc14345930"/>
       <w:r>
         <w:rPr>
           <w:rFonts w:eastAsia="Arial Unicode MS"/>
@@ -19657,10 +19663,10 @@
         </w:rPr>
       </w:pPr>
       <w:bookmarkStart w:id="148" w:name="_Toc46909572"/>
-      <w:bookmarkStart w:id="149" w:name="_Toc14345931"/>
-      <w:bookmarkStart w:id="150" w:name="_Toc507747264"/>
+      <w:bookmarkStart w:id="149" w:name="_Toc172810455"/>
+      <w:bookmarkStart w:id="150" w:name="_Toc14345931"/>
       <w:bookmarkStart w:id="151" w:name="_Toc204949537"/>
-      <w:bookmarkStart w:id="152" w:name="_Toc172810455"/>
+      <w:bookmarkStart w:id="152" w:name="_Toc507747264"/>
     </w:p>
     <w:p>
       <w:pPr>
@@ -19947,11 +19953,11 @@
         <w:pStyle w:val="4"/>
       </w:pPr>
       <w:bookmarkStart w:id="154" w:name="_Toc204949538"/>
-      <w:bookmarkStart w:id="155" w:name="_Toc14345932"/>
-      <w:bookmarkStart w:id="156" w:name="_Toc172810456"/>
-      <w:bookmarkStart w:id="157" w:name="_Toc46909573"/>
-      <w:bookmarkStart w:id="158" w:name="_Toc14606"/>
-      <w:bookmarkStart w:id="159" w:name="_Toc507747265"/>
+      <w:bookmarkStart w:id="155" w:name="_Toc507747265"/>
+      <w:bookmarkStart w:id="156" w:name="_Toc14345932"/>
+      <w:bookmarkStart w:id="157" w:name="_Toc172810456"/>
+      <w:bookmarkStart w:id="158" w:name="_Toc46909573"/>
+      <w:bookmarkStart w:id="159" w:name="_Toc14606"/>
       <w:r>
         <w:t>8.2.1 Referências aos Documentos Relevantes</w:t>
       </w:r>
@@ -20178,9 +20184,9 @@
       <w:r>
         <w:t xml:space="preserve">   </w:t>
       </w:r>
-      <w:bookmarkStart w:id="162" w:name="_Toc204949481"/>
-      <w:bookmarkStart w:id="163" w:name="_Toc172810391"/>
-      <w:bookmarkStart w:id="164" w:name="_Toc78782581"/>
+      <w:bookmarkStart w:id="162" w:name="_Toc172810391"/>
+      <w:bookmarkStart w:id="163" w:name="_Toc78782581"/>
+      <w:bookmarkStart w:id="164" w:name="_Toc204949481"/>
       <w:r>
         <w:t xml:space="preserve">QUADRO </w:t>
       </w:r>
@@ -20224,9 +20230,9 @@
       <w:bookmarkStart w:id="166" w:name="_Toc22317"/>
       <w:bookmarkStart w:id="167" w:name="_Toc172810457"/>
       <w:bookmarkStart w:id="168" w:name="_Toc46909574"/>
-      <w:bookmarkStart w:id="169" w:name="_Toc204949539"/>
-      <w:bookmarkStart w:id="170" w:name="_Toc14345933"/>
-      <w:bookmarkStart w:id="171" w:name="_Toc507747266"/>
+      <w:bookmarkStart w:id="169" w:name="_Toc14345933"/>
+      <w:bookmarkStart w:id="170" w:name="_Toc507747266"/>
+      <w:bookmarkStart w:id="171" w:name="_Toc204949539"/>
       <w:r>
         <w:t>8.2.2 Ambiente</w:t>
       </w:r>
@@ -20581,11 +20587,11 @@
         </w:rPr>
         <w:t xml:space="preserve">   </w:t>
       </w:r>
-      <w:bookmarkStart w:id="172" w:name="_Toc507751105"/>
-      <w:bookmarkStart w:id="173" w:name="_Toc78782582"/>
-      <w:bookmarkStart w:id="174" w:name="_Toc204949482"/>
-      <w:bookmarkStart w:id="175" w:name="_Toc172810392"/>
-      <w:bookmarkStart w:id="176" w:name="_Toc14343276"/>
+      <w:bookmarkStart w:id="172" w:name="_Toc204949482"/>
+      <w:bookmarkStart w:id="173" w:name="_Toc507751105"/>
+      <w:bookmarkStart w:id="174" w:name="_Toc14343276"/>
+      <w:bookmarkStart w:id="175" w:name="_Toc78782582"/>
+      <w:bookmarkStart w:id="176" w:name="_Toc172810392"/>
       <w:r>
         <w:t xml:space="preserve">QUADRO </w:t>
       </w:r>
@@ -20958,11 +20964,11 @@
         </w:rPr>
         <w:t xml:space="preserve">   </w:t>
       </w:r>
-      <w:bookmarkStart w:id="178" w:name="_Toc172810393"/>
-      <w:bookmarkStart w:id="179" w:name="_Toc78782583"/>
+      <w:bookmarkStart w:id="178" w:name="_Toc14343277"/>
+      <w:bookmarkStart w:id="179" w:name="_Toc204949483"/>
       <w:bookmarkStart w:id="180" w:name="_Toc507751106"/>
-      <w:bookmarkStart w:id="181" w:name="_Toc204949483"/>
-      <w:bookmarkStart w:id="182" w:name="_Toc14343277"/>
+      <w:bookmarkStart w:id="181" w:name="_Toc172810393"/>
+      <w:bookmarkStart w:id="182" w:name="_Toc78782583"/>
       <w:r>
         <w:t xml:space="preserve">QUADRO </w:t>
       </w:r>
@@ -21036,8 +21042,8 @@
           <w:color w:val="0000FF"/>
         </w:rPr>
       </w:pPr>
-      <w:bookmarkStart w:id="189" w:name="_Toc14345938"/>
-      <w:bookmarkStart w:id="190" w:name="_Toc507747271"/>
+      <w:bookmarkStart w:id="189" w:name="_Toc507747271"/>
+      <w:bookmarkStart w:id="190" w:name="_Toc14345938"/>
       <w:bookmarkStart w:id="191" w:name="_Toc46909579"/>
     </w:p>
     <w:p>
@@ -21083,10 +21089,10 @@
           <w:color w:val="0000FF"/>
         </w:rPr>
       </w:pPr>
-      <w:bookmarkStart w:id="195" w:name="_Toc46909582"/>
-      <w:bookmarkStart w:id="196" w:name="_Toc172810460"/>
-      <w:bookmarkStart w:id="197" w:name="_Toc204949542"/>
-      <w:bookmarkStart w:id="198" w:name="_Toc507747274"/>
+      <w:bookmarkStart w:id="195" w:name="_Toc172810460"/>
+      <w:bookmarkStart w:id="196" w:name="_Toc507747274"/>
+      <w:bookmarkStart w:id="197" w:name="_Toc46909582"/>
+      <w:bookmarkStart w:id="198" w:name="_Toc204949542"/>
       <w:bookmarkStart w:id="199" w:name="_Toc14345941"/>
       <w:r>
         <w:rPr>
@@ -21146,12 +21152,12 @@
           <w:color w:val="0000FF"/>
         </w:rPr>
       </w:pPr>
-      <w:bookmarkStart w:id="201" w:name="_Toc46909583"/>
-      <w:bookmarkStart w:id="202" w:name="_Toc28810"/>
-      <w:bookmarkStart w:id="203" w:name="_Toc172810461"/>
-      <w:bookmarkStart w:id="204" w:name="_Toc204949543"/>
-      <w:bookmarkStart w:id="205" w:name="_Toc14345942"/>
-      <w:bookmarkStart w:id="206" w:name="_Toc507747275"/>
+      <w:bookmarkStart w:id="201" w:name="_Toc172810461"/>
+      <w:bookmarkStart w:id="202" w:name="_Toc14345942"/>
+      <w:bookmarkStart w:id="203" w:name="_Toc507747275"/>
+      <w:bookmarkStart w:id="204" w:name="_Toc46909583"/>
+      <w:bookmarkStart w:id="205" w:name="_Toc28810"/>
+      <w:bookmarkStart w:id="206" w:name="_Toc204949543"/>
       <w:r>
         <w:rPr>
           <w:rFonts w:eastAsia="Arial Unicode MS"/>
@@ -21197,12 +21203,12 @@
       <w:pPr>
         <w:pStyle w:val="4"/>
       </w:pPr>
-      <w:bookmarkStart w:id="207" w:name="_Toc14345943"/>
+      <w:bookmarkStart w:id="207" w:name="_Toc12632"/>
       <w:bookmarkStart w:id="208" w:name="_Toc204949544"/>
-      <w:bookmarkStart w:id="209" w:name="_Toc172810462"/>
-      <w:bookmarkStart w:id="210" w:name="_Toc507747276"/>
-      <w:bookmarkStart w:id="211" w:name="_Toc12632"/>
-      <w:bookmarkStart w:id="212" w:name="_Toc46909584"/>
+      <w:bookmarkStart w:id="209" w:name="_Toc46909584"/>
+      <w:bookmarkStart w:id="210" w:name="_Toc14345943"/>
+      <w:bookmarkStart w:id="211" w:name="_Toc507747276"/>
+      <w:bookmarkStart w:id="212" w:name="_Toc172810462"/>
       <w:r>
         <w:t>9.1.1 Descrição da Metodologia</w:t>
       </w:r>
@@ -21237,9 +21243,9 @@
       <w:pPr>
         <w:pStyle w:val="4"/>
       </w:pPr>
-      <w:bookmarkStart w:id="213" w:name="_Toc13586"/>
-      <w:bookmarkStart w:id="214" w:name="_Toc172810463"/>
-      <w:bookmarkStart w:id="215" w:name="_Toc204949545"/>
+      <w:bookmarkStart w:id="213" w:name="_Toc204949545"/>
+      <w:bookmarkStart w:id="214" w:name="_Toc13586"/>
+      <w:bookmarkStart w:id="215" w:name="_Toc172810463"/>
       <w:bookmarkStart w:id="216" w:name="_Toc14345944"/>
       <w:bookmarkStart w:id="217" w:name="_Toc46909585"/>
       <w:bookmarkStart w:id="218" w:name="_Toc507747277"/>
@@ -22390,9 +22396,9 @@
       </w:pPr>
       <w:bookmarkStart w:id="219" w:name="_Toc14343281"/>
       <w:bookmarkStart w:id="220" w:name="_Toc172810394"/>
-      <w:bookmarkStart w:id="221" w:name="_Toc204949484"/>
-      <w:bookmarkStart w:id="222" w:name="_Toc507751111"/>
-      <w:bookmarkStart w:id="223" w:name="_Toc78782587"/>
+      <w:bookmarkStart w:id="221" w:name="_Toc507751111"/>
+      <w:bookmarkStart w:id="222" w:name="_Toc78782587"/>
+      <w:bookmarkStart w:id="223" w:name="_Toc204949484"/>
       <w:r>
         <w:rPr>
           <w:color w:val="0000FF"/>
@@ -22455,12 +22461,12 @@
           <w:color w:val="0000FF"/>
         </w:rPr>
       </w:pPr>
-      <w:bookmarkStart w:id="224" w:name="_Toc507747278"/>
-      <w:bookmarkStart w:id="225" w:name="_Toc46909586"/>
-      <w:bookmarkStart w:id="226" w:name="_Toc13797"/>
-      <w:bookmarkStart w:id="227" w:name="_Toc172810464"/>
-      <w:bookmarkStart w:id="228" w:name="_Toc14345945"/>
-      <w:bookmarkStart w:id="229" w:name="_Toc204949546"/>
+      <w:bookmarkStart w:id="224" w:name="_Toc172810464"/>
+      <w:bookmarkStart w:id="225" w:name="_Toc13797"/>
+      <w:bookmarkStart w:id="226" w:name="_Toc507747278"/>
+      <w:bookmarkStart w:id="227" w:name="_Toc46909586"/>
+      <w:bookmarkStart w:id="228" w:name="_Toc204949546"/>
+      <w:bookmarkStart w:id="229" w:name="_Toc14345945"/>
       <w:r>
         <w:rPr>
           <w:color w:val="0000FF"/>
@@ -22672,11 +22678,11 @@
           <w:color w:val="0000FF"/>
         </w:rPr>
       </w:pPr>
-      <w:bookmarkStart w:id="230" w:name="_Toc204949485"/>
-      <w:bookmarkStart w:id="231" w:name="_Toc78782588"/>
-      <w:bookmarkStart w:id="232" w:name="_Toc14343282"/>
+      <w:bookmarkStart w:id="230" w:name="_Toc14343282"/>
+      <w:bookmarkStart w:id="231" w:name="_Toc507751112"/>
+      <w:bookmarkStart w:id="232" w:name="_Toc204949485"/>
       <w:bookmarkStart w:id="233" w:name="_Toc172810395"/>
-      <w:bookmarkStart w:id="234" w:name="_Toc507751112"/>
+      <w:bookmarkStart w:id="234" w:name="_Toc78782588"/>
       <w:r>
         <w:rPr>
           <w:color w:val="0000FF"/>
@@ -22740,12 +22746,12 @@
           <w:color w:val="0000FF"/>
         </w:rPr>
       </w:pPr>
-      <w:bookmarkStart w:id="235" w:name="_Toc204949547"/>
-      <w:bookmarkStart w:id="236" w:name="_Toc172810465"/>
-      <w:bookmarkStart w:id="237" w:name="_Toc46909587"/>
-      <w:bookmarkStart w:id="238" w:name="_Toc13337"/>
+      <w:bookmarkStart w:id="235" w:name="_Toc172810465"/>
+      <w:bookmarkStart w:id="236" w:name="_Toc204949547"/>
+      <w:bookmarkStart w:id="237" w:name="_Toc13337"/>
+      <w:bookmarkStart w:id="238" w:name="_Toc507747279"/>
       <w:bookmarkStart w:id="239" w:name="_Toc14345946"/>
-      <w:bookmarkStart w:id="240" w:name="_Toc507747279"/>
+      <w:bookmarkStart w:id="240" w:name="_Toc46909587"/>
       <w:r>
         <w:rPr>
           <w:color w:val="0000FF"/>
@@ -23018,11 +23024,11 @@
           <w:color w:val="0000FF"/>
         </w:rPr>
       </w:pPr>
-      <w:bookmarkStart w:id="241" w:name="_Toc172810396"/>
-      <w:bookmarkStart w:id="242" w:name="_Toc78782589"/>
-      <w:bookmarkStart w:id="243" w:name="_Toc204949486"/>
+      <w:bookmarkStart w:id="241" w:name="_Toc204949486"/>
+      <w:bookmarkStart w:id="242" w:name="_Toc14343283"/>
+      <w:bookmarkStart w:id="243" w:name="_Toc172810396"/>
       <w:bookmarkStart w:id="244" w:name="_Toc507751113"/>
-      <w:bookmarkStart w:id="245" w:name="_Toc14343283"/>
+      <w:bookmarkStart w:id="245" w:name="_Toc78782589"/>
       <w:r>
         <w:rPr>
           <w:color w:val="0000FF"/>
@@ -23086,10 +23092,10 @@
           <w:color w:val="0000FF"/>
         </w:rPr>
       </w:pPr>
-      <w:bookmarkStart w:id="246" w:name="_Toc172810466"/>
+      <w:bookmarkStart w:id="246" w:name="_Toc507747280"/>
       <w:bookmarkStart w:id="247" w:name="_Toc14345947"/>
-      <w:bookmarkStart w:id="248" w:name="_Toc204949548"/>
-      <w:bookmarkStart w:id="249" w:name="_Toc507747280"/>
+      <w:bookmarkStart w:id="248" w:name="_Toc172810466"/>
+      <w:bookmarkStart w:id="249" w:name="_Toc204949548"/>
       <w:bookmarkStart w:id="250" w:name="_Toc46909588"/>
       <w:bookmarkStart w:id="251" w:name="_Toc2408"/>
       <w:r>
@@ -23438,10 +23444,10 @@
         </w:rPr>
       </w:pPr>
       <w:bookmarkStart w:id="252" w:name="_Toc14343284"/>
-      <w:bookmarkStart w:id="253" w:name="_Toc204949487"/>
-      <w:bookmarkStart w:id="254" w:name="_Toc78782590"/>
-      <w:bookmarkStart w:id="255" w:name="_Toc507751114"/>
-      <w:bookmarkStart w:id="256" w:name="_Toc172810397"/>
+      <w:bookmarkStart w:id="253" w:name="_Toc78782590"/>
+      <w:bookmarkStart w:id="254" w:name="_Toc204949487"/>
+      <w:bookmarkStart w:id="255" w:name="_Toc172810397"/>
+      <w:bookmarkStart w:id="256" w:name="_Toc507751114"/>
       <w:r>
         <w:rPr>
           <w:color w:val="0000FF"/>
@@ -23505,12 +23511,12 @@
           <w:color w:val="0000FF"/>
         </w:rPr>
       </w:pPr>
-      <w:bookmarkStart w:id="257" w:name="_Toc46909589"/>
-      <w:bookmarkStart w:id="258" w:name="_Toc172810467"/>
-      <w:bookmarkStart w:id="259" w:name="_Toc204949549"/>
-      <w:bookmarkStart w:id="260" w:name="_Toc14345948"/>
-      <w:bookmarkStart w:id="261" w:name="_Toc507747281"/>
-      <w:bookmarkStart w:id="262" w:name="_Toc25573"/>
+      <w:bookmarkStart w:id="257" w:name="_Toc172810467"/>
+      <w:bookmarkStart w:id="258" w:name="_Toc46909589"/>
+      <w:bookmarkStart w:id="259" w:name="_Toc507747281"/>
+      <w:bookmarkStart w:id="260" w:name="_Toc25573"/>
+      <w:bookmarkStart w:id="261" w:name="_Toc204949549"/>
+      <w:bookmarkStart w:id="262" w:name="_Toc14345948"/>
       <w:r>
         <w:rPr>
           <w:color w:val="0000FF"/>
@@ -24255,8 +24261,8 @@
         <w:br w:type="page"/>
       </w:r>
       <w:bookmarkStart w:id="269" w:name="_Toc10367"/>
-      <w:bookmarkStart w:id="270" w:name="_Toc284603410"/>
-      <w:bookmarkStart w:id="271" w:name="_Toc192060122"/>
+      <w:bookmarkStart w:id="270" w:name="_Toc192060122"/>
+      <w:bookmarkStart w:id="271" w:name="_Toc284603410"/>
       <w:r>
         <w:t>APÊNDICE B – RELATÓRIO DE DESEMPENHO</w:t>
       </w:r>
@@ -24468,8 +24474,8 @@
       <w:pPr>
         <w:pStyle w:val="2"/>
       </w:pPr>
-      <w:bookmarkStart w:id="284" w:name="_Toc172810481"/>
-      <w:bookmarkStart w:id="285" w:name="_Toc204949563"/>
+      <w:bookmarkStart w:id="284" w:name="_Toc204949563"/>
+      <w:bookmarkStart w:id="285" w:name="_Toc172810481"/>
       <w:bookmarkStart w:id="286" w:name="_Toc4481"/>
       <w:r>
         <w:t>APÊNDICE K – RECURSOS DE APOIO À IMPLANTAÇÃO</w:t>

</xml_diff>